<commit_message>
chore: release 0.1.1 and push latest supabase migration updates
</commit_message>
<xml_diff>
--- a/src/lib/templates/template_dislip.docx
+++ b/src/lib/templates/template_dislip.docx
@@ -75,7 +75,7 @@
         <mc:AlternateContent>
           <mc:Choice Requires="wps">
             <w:drawing>
-              <wp:anchor distT="0" distB="0" distL="114300" distR="114300" simplePos="0" relativeHeight="251659264" behindDoc="1" locked="0" layoutInCell="1" allowOverlap="1" wp14:anchorId="6BEE0F52" wp14:editId="647CC250">
+              <wp:anchor distT="0" distB="0" distL="114300" distR="114300" simplePos="0" relativeHeight="251659264" behindDoc="1" locked="0" layoutInCell="1" allowOverlap="1" wp14:anchorId="6BEE0F52" wp14:editId="671C07AD">
                 <wp:simplePos x="0" y="0"/>
                 <wp:positionH relativeFrom="column">
                   <wp:posOffset>-99060</wp:posOffset>
@@ -101,9 +101,7 @@
                           <a:avLst/>
                         </a:prstGeom>
                         <a:solidFill>
-                          <a:schemeClr val="bg2">
-                            <a:lumMod val="90000"/>
-                          </a:schemeClr>
+                          <a:schemeClr val="bg2"/>
                         </a:solidFill>
                         <a:ln w="6350">
                           <a:solidFill>
@@ -134,7 +132,7 @@
                 <v:stroke joinstyle="miter"/>
                 <v:path gradientshapeok="t" o:connecttype="rect"/>
               </v:shapetype>
-              <v:shape id="Casella di testo 6" o:spid="_x0000_s1026" type="#_x0000_t202" style="position:absolute;margin-left:-7.8pt;margin-top:11.1pt;width:491.45pt;height:101.05pt;z-index:-251657216;visibility:visible;mso-wrap-style:square;mso-wrap-distance-left:9pt;mso-wrap-distance-top:0;mso-wrap-distance-right:9pt;mso-wrap-distance-bottom:0;mso-position-horizontal:absolute;mso-position-horizontal-relative:text;mso-position-vertical:absolute;mso-position-vertical-relative:text;v-text-anchor:top" o:gfxdata="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" fillcolor="#d0d0d0 [2894]" strokeweight=".5pt">
+              <v:shape id="Casella di testo 6" o:spid="_x0000_s1026" type="#_x0000_t202" style="position:absolute;margin-left:-7.8pt;margin-top:11.1pt;width:491.45pt;height:101.05pt;z-index:-251657216;visibility:visible;mso-wrap-style:square;mso-wrap-distance-left:9pt;mso-wrap-distance-top:0;mso-wrap-distance-right:9pt;mso-wrap-distance-bottom:0;mso-position-horizontal:absolute;mso-position-horizontal-relative:text;mso-position-vertical:absolute;mso-position-vertical-relative:text;v-text-anchor:top" o:gfxdata="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" fillcolor="#e8e8e8 [3214]" strokeweight=".5pt">
                 <v:textbox>
                   <w:txbxContent>
                     <w:p/>
@@ -290,6 +288,43 @@
           <w:rFonts w:ascii="Arial" w:hAnsi="Arial" w:cs="Arial"/>
         </w:rPr>
         <w:t>Telefono: {telefono};</w:t>
+      </w:r>
+      <w:r>
+        <w:rPr>
+          <w:rFonts w:ascii="Arial" w:hAnsi="Arial" w:cs="Arial"/>
+        </w:rPr>
+        <w:tab/>
+      </w:r>
+      <w:r>
+        <w:rPr>
+          <w:rFonts w:ascii="Arial" w:hAnsi="Arial" w:cs="Arial"/>
+        </w:rPr>
+        <w:tab/>
+      </w:r>
+      <w:r>
+        <w:rPr>
+          <w:rFonts w:ascii="Arial" w:hAnsi="Arial" w:cs="Arial"/>
+        </w:rPr>
+        <w:tab/>
+      </w:r>
+      <w:r>
+        <w:rPr>
+          <w:rFonts w:ascii="Arial" w:hAnsi="Arial" w:cs="Arial"/>
+        </w:rPr>
+        <w:tab/>
+      </w:r>
+      <w:r>
+        <w:rPr>
+          <w:rFonts w:ascii="Arial" w:hAnsi="Arial" w:cs="Arial"/>
+        </w:rPr>
+        <w:tab/>
+      </w:r>
+      <w:r>
+        <w:rPr>
+          <w:rFonts w:ascii="Arial" w:hAnsi="Arial" w:cs="Arial"/>
+        </w:rPr>
+        <w:tab/>
+        <w:t>Esenzione: {esenzione}</w:t>
       </w:r>
     </w:p>
     <w:p>

</xml_diff>

<commit_message>
Update templates and project changes
</commit_message>
<xml_diff>
--- a/src/lib/templates/template_dislip.docx
+++ b/src/lib/templates/template_dislip.docx
@@ -1,6 +1,6 @@
 
 <file path=word/document.xml><?xml version="1.0" encoding="utf-8"?>
-<w:document xmlns:wpc="http://schemas.microsoft.com/office/word/2010/wordprocessingCanvas" xmlns:cx="http://schemas.microsoft.com/office/drawing/2014/chartex" xmlns:cx1="http://schemas.microsoft.com/office/drawing/2015/9/8/chartex" xmlns:cx2="http://schemas.microsoft.com/office/drawing/2015/10/21/chartex" xmlns:cx3="http://schemas.microsoft.com/office/drawing/2016/5/9/chartex" xmlns:cx4="http://schemas.microsoft.com/office/drawing/2016/5/10/chartex" xmlns:cx5="http://schemas.microsoft.com/office/drawing/2016/5/11/chartex" xmlns:cx6="http://schemas.microsoft.com/office/drawing/2016/5/12/chartex" xmlns:cx7="http://schemas.microsoft.com/office/drawing/2016/5/13/chartex" xmlns:cx8="http://schemas.microsoft.com/office/drawing/2016/5/14/chartex" xmlns:mc="http://schemas.openxmlformats.org/markup-compatibility/2006" xmlns:aink="http://schemas.microsoft.com/office/drawing/2016/ink" xmlns:am3d="http://schemas.microsoft.com/office/drawing/2017/model3d" xmlns:o="urn:schemas-microsoft-com:office:office" xmlns:oel="http://schemas.microsoft.com/office/2019/extlst" xmlns:r="http://schemas.openxmlformats.org/officeDocument/2006/relationships" xmlns:m="http://schemas.openxmlformats.org/officeDocument/2006/math" xmlns:v="urn:schemas-microsoft-com:vml" xmlns:wp14="http://schemas.microsoft.com/office/word/2010/wordprocessingDrawing" xmlns:wp="http://schemas.openxmlformats.org/drawingml/2006/wordprocessingDrawing" xmlns:w10="urn:schemas-microsoft-com:office:word" xmlns:w="http://schemas.openxmlformats.org/wordprocessingml/2006/main" xmlns:w14="http://schemas.microsoft.com/office/word/2010/wordml" xmlns:w15="http://schemas.microsoft.com/office/word/2012/wordml" xmlns:w16cex="http://schemas.microsoft.com/office/word/2018/wordml/cex" xmlns:w16cid="http://schemas.microsoft.com/office/word/2016/wordml/cid" xmlns:w16="http://schemas.microsoft.com/office/word/2018/wordml" xmlns:w16du="http://schemas.microsoft.com/office/word/2023/wordml/word16du" xmlns:w16sdtdh="http://schemas.microsoft.com/office/word/2020/wordml/sdtdatahash" xmlns:w16sdtfl="http://schemas.microsoft.com/office/word/2024/wordml/sdtformatlock" xmlns:w16se="http://schemas.microsoft.com/office/word/2015/wordml/symex" xmlns:wpg="http://schemas.microsoft.com/office/word/2010/wordprocessingGroup" xmlns:wpi="http://schemas.microsoft.com/office/word/2010/wordprocessingInk" xmlns:wne="http://schemas.microsoft.com/office/word/2006/wordml" xmlns:wps="http://schemas.microsoft.com/office/word/2010/wordprocessingShape" mc:Ignorable="w14 w15 w16se w16cid w16 w16cex w16sdtdh w16sdtfl w16du wp14">
+<w:document xmlns:wpc="http://schemas.microsoft.com/office/word/2010/wordprocessingCanvas" xmlns:cx="http://schemas.microsoft.com/office/drawing/2014/chartex" xmlns:cx1="http://schemas.microsoft.com/office/drawing/2015/9/8/chartex" xmlns:cx2="http://schemas.microsoft.com/office/drawing/2015/10/21/chartex" xmlns:cx3="http://schemas.microsoft.com/office/drawing/2016/5/9/chartex" xmlns:cx4="http://schemas.microsoft.com/office/drawing/2016/5/10/chartex" xmlns:cx5="http://schemas.microsoft.com/office/drawing/2016/5/11/chartex" xmlns:cx6="http://schemas.microsoft.com/office/drawing/2016/5/12/chartex" xmlns:cx7="http://schemas.microsoft.com/office/drawing/2016/5/13/chartex" xmlns:cx8="http://schemas.microsoft.com/office/drawing/2016/5/14/chartex" xmlns:mc="http://schemas.openxmlformats.org/markup-compatibility/2006" xmlns:m="http://schemas.openxmlformats.org/officeDocument/2006/math" xmlns:aink="http://schemas.microsoft.com/office/drawing/2016/ink" xmlns:am3d="http://schemas.microsoft.com/office/drawing/2017/model3d" xmlns:oel="http://schemas.microsoft.com/office/2019/extlst" xmlns:r="http://schemas.openxmlformats.org/officeDocument/2006/relationships" xmlns:wp14="http://schemas.microsoft.com/office/word/2010/wordprocessingDrawing" xmlns:wp="http://schemas.openxmlformats.org/drawingml/2006/wordprocessingDrawing" xmlns:wpg="http://schemas.microsoft.com/office/word/2010/wordprocessingGroup" xmlns:wpi="http://schemas.microsoft.com/office/word/2010/wordprocessingInk" xmlns:wps="http://schemas.microsoft.com/office/word/2010/wordprocessingShape" xmlns:o="urn:schemas-microsoft-com:office:office" xmlns:v="urn:schemas-microsoft-com:vml" xmlns:w10="urn:schemas-microsoft-com:office:word" xmlns:w="http://schemas.openxmlformats.org/wordprocessingml/2006/main" xmlns:w14="http://schemas.microsoft.com/office/word/2010/wordml" xmlns:w15="http://schemas.microsoft.com/office/word/2012/wordml" xmlns:w16cex="http://schemas.microsoft.com/office/word/2018/wordml/cex" xmlns:w16cid="http://schemas.microsoft.com/office/word/2016/wordml/cid" xmlns:w16="http://schemas.microsoft.com/office/word/2018/wordml" xmlns:w16sdtdh="http://schemas.microsoft.com/office/word/2020/wordml/sdtdatahash" xmlns:w16sdtfl="http://schemas.microsoft.com/office/word/2024/wordml/sdtformatlock" xmlns:w16se="http://schemas.microsoft.com/office/word/2015/wordml/symex" xmlns:w16du="http://schemas.microsoft.com/office/word/2023/wordml/word16du" xmlns:wne="http://schemas.microsoft.com/office/word/2006/wordml" mc:Ignorable="w14 w15 w16se w16cid w16 w16cex w16sdtdh w16sdtfl w16du wp14">
   <w:body>
     <w:p>
       <w:pPr>
@@ -16,6 +16,32 @@
           <w:rFonts w:ascii="Arial" w:hAnsi="Arial" w:cs="Arial"/>
           <w:b/>
           <w:bCs/>
+        </w:rPr>
+        <w:t>VISITA CARDIOLOGICA</w:t>
+      </w:r>
+    </w:p>
+    <w:p>
+      <w:pPr>
+        <w:jc w:val="center"/>
+        <w:rPr>
+          <w:rFonts w:ascii="Arial" w:hAnsi="Arial" w:cs="Arial"/>
+          <w:b/>
+          <w:bCs/>
+          <w:i/>
+          <w:iCs/>
+          <w:sz w:val="22"/>
+          <w:szCs w:val="22"/>
+        </w:rPr>
+      </w:pPr>
+      <w:r>
+        <w:rPr>
+          <w:rFonts w:ascii="Arial" w:hAnsi="Arial" w:cs="Arial"/>
+          <w:b/>
+          <w:bCs/>
+          <w:i/>
+          <w:iCs/>
+          <w:sz w:val="22"/>
+          <w:szCs w:val="22"/>
         </w:rPr>
         <w:t>{titolo}</w:t>
       </w:r>
@@ -750,31 +776,49 @@
           <w:b/>
           <w:bCs/>
         </w:rPr>
-        <w:t>Esami ematici</w:t>
-      </w:r>
-      <w:r>
+        <w:t>Valutazione odierna</w:t>
+      </w:r>
+    </w:p>
+    <w:p>
+      <w:pPr>
+        <w:spacing w:line="276" w:lineRule="auto"/>
+        <w:rPr>
+          <w:rFonts w:ascii="Arial" w:hAnsi="Arial" w:cs="Arial"/>
+        </w:rPr>
+      </w:pPr>
+      <w:r>
+        <w:rPr>
+          <w:rFonts w:ascii="Arial" w:hAnsi="Arial" w:cs="Arial"/>
+        </w:rPr>
+        <w:t>{valutazione_odierna}</w:t>
+      </w:r>
+    </w:p>
+    <w:p>
+      <w:pPr>
+        <w:spacing w:line="276" w:lineRule="auto"/>
         <w:rPr>
           <w:rFonts w:ascii="Arial" w:hAnsi="Arial" w:cs="Arial"/>
           <w:b/>
           <w:bCs/>
         </w:rPr>
-        <w:t xml:space="preserve"> </w:t>
-      </w:r>
-      <w:r>
+      </w:pPr>
+    </w:p>
+    <w:p>
+      <w:pPr>
+        <w:spacing w:line="276" w:lineRule="auto"/>
         <w:rPr>
           <w:rFonts w:ascii="Arial" w:hAnsi="Arial" w:cs="Arial"/>
           <w:b/>
           <w:bCs/>
         </w:rPr>
-        <w:t>(</w:t>
-      </w:r>
+      </w:pPr>
       <w:r>
         <w:rPr>
           <w:rFonts w:ascii="Arial" w:hAnsi="Arial" w:cs="Arial"/>
           <w:b/>
           <w:bCs/>
         </w:rPr>
-        <w:t>{data_ee}</w:t>
+        <w:t>Esami ematici</w:t>
       </w:r>
       <w:r>
         <w:rPr>
@@ -782,60 +826,102 @@
           <w:b/>
           <w:bCs/>
         </w:rPr>
-        <w:t>)</w:t>
-      </w:r>
-    </w:p>
-    <w:p>
-      <w:pPr>
-        <w:spacing w:line="276" w:lineRule="auto"/>
-        <w:rPr>
-          <w:rFonts w:ascii="Arial" w:hAnsi="Arial" w:cs="Arial"/>
-        </w:rPr>
-      </w:pPr>
-      <w:r>
-        <w:rPr>
-          <w:rFonts w:ascii="Arial" w:hAnsi="Arial" w:cs="Arial"/>
-        </w:rPr>
-        <w:t>{</w:t>
-      </w:r>
-      <w:proofErr w:type="spellStart"/>
-      <w:r>
-        <w:rPr>
-          <w:rFonts w:ascii="Arial" w:hAnsi="Arial" w:cs="Arial"/>
-        </w:rPr>
-        <w:t>ee</w:t>
-      </w:r>
-      <w:proofErr w:type="spellEnd"/>
-      <w:r>
-        <w:rPr>
-          <w:rFonts w:ascii="Arial" w:hAnsi="Arial" w:cs="Arial"/>
-        </w:rPr>
-        <w:t>}</w:t>
-      </w:r>
-    </w:p>
-    <w:p>
-      <w:pPr>
-        <w:spacing w:line="276" w:lineRule="auto"/>
-        <w:rPr>
-          <w:rFonts w:ascii="Arial" w:hAnsi="Arial" w:cs="Arial"/>
-        </w:rPr>
-      </w:pPr>
-    </w:p>
-    <w:p>
-      <w:pPr>
-        <w:spacing w:line="276" w:lineRule="auto"/>
+        <w:t xml:space="preserve"> </w:t>
+      </w:r>
+      <w:r>
         <w:rPr>
           <w:rFonts w:ascii="Arial" w:hAnsi="Arial" w:cs="Arial"/>
           <w:b/>
           <w:bCs/>
         </w:rPr>
-      </w:pPr>
+        <w:t>(</w:t>
+      </w:r>
       <w:r>
         <w:rPr>
           <w:rFonts w:ascii="Arial" w:hAnsi="Arial" w:cs="Arial"/>
           <w:b/>
           <w:bCs/>
         </w:rPr>
+        <w:t>{</w:t>
+      </w:r>
+      <w:proofErr w:type="spellStart"/>
+      <w:r>
+        <w:rPr>
+          <w:rFonts w:ascii="Arial" w:hAnsi="Arial" w:cs="Arial"/>
+          <w:b/>
+          <w:bCs/>
+        </w:rPr>
+        <w:t>data_ee</w:t>
+      </w:r>
+      <w:proofErr w:type="spellEnd"/>
+      <w:r>
+        <w:rPr>
+          <w:rFonts w:ascii="Arial" w:hAnsi="Arial" w:cs="Arial"/>
+          <w:b/>
+          <w:bCs/>
+        </w:rPr>
+        <w:t>}</w:t>
+      </w:r>
+      <w:r>
+        <w:rPr>
+          <w:rFonts w:ascii="Arial" w:hAnsi="Arial" w:cs="Arial"/>
+          <w:b/>
+          <w:bCs/>
+        </w:rPr>
+        <w:t>)</w:t>
+      </w:r>
+    </w:p>
+    <w:p>
+      <w:pPr>
+        <w:spacing w:line="276" w:lineRule="auto"/>
+        <w:rPr>
+          <w:rFonts w:ascii="Arial" w:hAnsi="Arial" w:cs="Arial"/>
+        </w:rPr>
+      </w:pPr>
+      <w:r>
+        <w:rPr>
+          <w:rFonts w:ascii="Arial" w:hAnsi="Arial" w:cs="Arial"/>
+        </w:rPr>
+        <w:t>{</w:t>
+      </w:r>
+      <w:proofErr w:type="spellStart"/>
+      <w:r>
+        <w:rPr>
+          <w:rFonts w:ascii="Arial" w:hAnsi="Arial" w:cs="Arial"/>
+        </w:rPr>
+        <w:t>ee</w:t>
+      </w:r>
+      <w:proofErr w:type="spellEnd"/>
+      <w:r>
+        <w:rPr>
+          <w:rFonts w:ascii="Arial" w:hAnsi="Arial" w:cs="Arial"/>
+        </w:rPr>
+        <w:t>}</w:t>
+      </w:r>
+    </w:p>
+    <w:p>
+      <w:pPr>
+        <w:spacing w:line="276" w:lineRule="auto"/>
+        <w:rPr>
+          <w:rFonts w:ascii="Arial" w:hAnsi="Arial" w:cs="Arial"/>
+        </w:rPr>
+      </w:pPr>
+    </w:p>
+    <w:p>
+      <w:pPr>
+        <w:spacing w:line="276" w:lineRule="auto"/>
+        <w:rPr>
+          <w:rFonts w:ascii="Arial" w:hAnsi="Arial" w:cs="Arial"/>
+          <w:b/>
+          <w:bCs/>
+        </w:rPr>
+      </w:pPr>
+      <w:r>
+        <w:rPr>
+          <w:rFonts w:ascii="Arial" w:hAnsi="Arial" w:cs="Arial"/>
+          <w:b/>
+          <w:bCs/>
+        </w:rPr>
         <w:t>Valutazione del rischio cardiovascolare</w:t>
       </w:r>
     </w:p>
@@ -1176,6 +1262,7 @@
         <w:rPr>
           <w:rFonts w:ascii="Arial" w:hAnsi="Arial" w:cs="Arial"/>
         </w:rPr>
+        <w:lastRenderedPageBreak/>
         <w:t>{dottssasp3} {specializzando3}</w:t>
       </w:r>
     </w:p>
@@ -1192,7 +1279,7 @@
 </file>
 
 <file path=word/endnotes.xml><?xml version="1.0" encoding="utf-8"?>
-<w:endnotes xmlns:wpc="http://schemas.microsoft.com/office/word/2010/wordprocessingCanvas" xmlns:cx="http://schemas.microsoft.com/office/drawing/2014/chartex" xmlns:cx1="http://schemas.microsoft.com/office/drawing/2015/9/8/chartex" xmlns:cx2="http://schemas.microsoft.com/office/drawing/2015/10/21/chartex" xmlns:cx3="http://schemas.microsoft.com/office/drawing/2016/5/9/chartex" xmlns:cx4="http://schemas.microsoft.com/office/drawing/2016/5/10/chartex" xmlns:cx5="http://schemas.microsoft.com/office/drawing/2016/5/11/chartex" xmlns:cx6="http://schemas.microsoft.com/office/drawing/2016/5/12/chartex" xmlns:cx7="http://schemas.microsoft.com/office/drawing/2016/5/13/chartex" xmlns:cx8="http://schemas.microsoft.com/office/drawing/2016/5/14/chartex" xmlns:mc="http://schemas.openxmlformats.org/markup-compatibility/2006" xmlns:aink="http://schemas.microsoft.com/office/drawing/2016/ink" xmlns:am3d="http://schemas.microsoft.com/office/drawing/2017/model3d" xmlns:o="urn:schemas-microsoft-com:office:office" xmlns:oel="http://schemas.microsoft.com/office/2019/extlst" xmlns:r="http://schemas.openxmlformats.org/officeDocument/2006/relationships" xmlns:m="http://schemas.openxmlformats.org/officeDocument/2006/math" xmlns:v="urn:schemas-microsoft-com:vml" xmlns:wp14="http://schemas.microsoft.com/office/word/2010/wordprocessingDrawing" xmlns:wp="http://schemas.openxmlformats.org/drawingml/2006/wordprocessingDrawing" xmlns:w10="urn:schemas-microsoft-com:office:word" xmlns:w="http://schemas.openxmlformats.org/wordprocessingml/2006/main" xmlns:w14="http://schemas.microsoft.com/office/word/2010/wordml" xmlns:w15="http://schemas.microsoft.com/office/word/2012/wordml" xmlns:w16cex="http://schemas.microsoft.com/office/word/2018/wordml/cex" xmlns:w16cid="http://schemas.microsoft.com/office/word/2016/wordml/cid" xmlns:w16="http://schemas.microsoft.com/office/word/2018/wordml" xmlns:w16du="http://schemas.microsoft.com/office/word/2023/wordml/word16du" xmlns:w16sdtdh="http://schemas.microsoft.com/office/word/2020/wordml/sdtdatahash" xmlns:w16sdtfl="http://schemas.microsoft.com/office/word/2024/wordml/sdtformatlock" xmlns:w16se="http://schemas.microsoft.com/office/word/2015/wordml/symex" xmlns:wpg="http://schemas.microsoft.com/office/word/2010/wordprocessingGroup" xmlns:wpi="http://schemas.microsoft.com/office/word/2010/wordprocessingInk" xmlns:wne="http://schemas.microsoft.com/office/word/2006/wordml" xmlns:wps="http://schemas.microsoft.com/office/word/2010/wordprocessingShape" mc:Ignorable="w14 w15 w16se w16cid w16 w16cex w16sdtdh w16sdtfl w16du wp14">
+<w:endnotes xmlns:wpc="http://schemas.microsoft.com/office/word/2010/wordprocessingCanvas" xmlns:cx="http://schemas.microsoft.com/office/drawing/2014/chartex" xmlns:cx1="http://schemas.microsoft.com/office/drawing/2015/9/8/chartex" xmlns:cx2="http://schemas.microsoft.com/office/drawing/2015/10/21/chartex" xmlns:cx3="http://schemas.microsoft.com/office/drawing/2016/5/9/chartex" xmlns:cx4="http://schemas.microsoft.com/office/drawing/2016/5/10/chartex" xmlns:cx5="http://schemas.microsoft.com/office/drawing/2016/5/11/chartex" xmlns:cx6="http://schemas.microsoft.com/office/drawing/2016/5/12/chartex" xmlns:cx7="http://schemas.microsoft.com/office/drawing/2016/5/13/chartex" xmlns:cx8="http://schemas.microsoft.com/office/drawing/2016/5/14/chartex" xmlns:mc="http://schemas.openxmlformats.org/markup-compatibility/2006" xmlns:m="http://schemas.openxmlformats.org/officeDocument/2006/math" xmlns:aink="http://schemas.microsoft.com/office/drawing/2016/ink" xmlns:am3d="http://schemas.microsoft.com/office/drawing/2017/model3d" xmlns:oel="http://schemas.microsoft.com/office/2019/extlst" xmlns:r="http://schemas.openxmlformats.org/officeDocument/2006/relationships" xmlns:wp14="http://schemas.microsoft.com/office/word/2010/wordprocessingDrawing" xmlns:wp="http://schemas.openxmlformats.org/drawingml/2006/wordprocessingDrawing" xmlns:wpg="http://schemas.microsoft.com/office/word/2010/wordprocessingGroup" xmlns:wpi="http://schemas.microsoft.com/office/word/2010/wordprocessingInk" xmlns:wps="http://schemas.microsoft.com/office/word/2010/wordprocessingShape" xmlns:o="urn:schemas-microsoft-com:office:office" xmlns:v="urn:schemas-microsoft-com:vml" xmlns:w10="urn:schemas-microsoft-com:office:word" xmlns:w="http://schemas.openxmlformats.org/wordprocessingml/2006/main" xmlns:w14="http://schemas.microsoft.com/office/word/2010/wordml" xmlns:w15="http://schemas.microsoft.com/office/word/2012/wordml" xmlns:w16cex="http://schemas.microsoft.com/office/word/2018/wordml/cex" xmlns:w16cid="http://schemas.microsoft.com/office/word/2016/wordml/cid" xmlns:w16="http://schemas.microsoft.com/office/word/2018/wordml" xmlns:w16sdtdh="http://schemas.microsoft.com/office/word/2020/wordml/sdtdatahash" xmlns:w16sdtfl="http://schemas.microsoft.com/office/word/2024/wordml/sdtformatlock" xmlns:w16se="http://schemas.microsoft.com/office/word/2015/wordml/symex" xmlns:w16du="http://schemas.microsoft.com/office/word/2023/wordml/word16du" xmlns:wne="http://schemas.microsoft.com/office/word/2006/wordml" mc:Ignorable="w14 w15 w16se w16cid w16 w16cex w16sdtdh w16sdtfl w16du wp14">
   <w:endnote w:type="separator" w:id="-1">
     <w:p>
       <w:r>
@@ -1211,7 +1298,7 @@
 </file>
 
 <file path=word/footer1.xml><?xml version="1.0" encoding="utf-8"?>
-<w:ftr xmlns:wpc="http://schemas.microsoft.com/office/word/2010/wordprocessingCanvas" xmlns:cx="http://schemas.microsoft.com/office/drawing/2014/chartex" xmlns:cx1="http://schemas.microsoft.com/office/drawing/2015/9/8/chartex" xmlns:cx2="http://schemas.microsoft.com/office/drawing/2015/10/21/chartex" xmlns:cx3="http://schemas.microsoft.com/office/drawing/2016/5/9/chartex" xmlns:cx4="http://schemas.microsoft.com/office/drawing/2016/5/10/chartex" xmlns:cx5="http://schemas.microsoft.com/office/drawing/2016/5/11/chartex" xmlns:cx6="http://schemas.microsoft.com/office/drawing/2016/5/12/chartex" xmlns:cx7="http://schemas.microsoft.com/office/drawing/2016/5/13/chartex" xmlns:cx8="http://schemas.microsoft.com/office/drawing/2016/5/14/chartex" xmlns:mc="http://schemas.openxmlformats.org/markup-compatibility/2006" xmlns:aink="http://schemas.microsoft.com/office/drawing/2016/ink" xmlns:am3d="http://schemas.microsoft.com/office/drawing/2017/model3d" xmlns:o="urn:schemas-microsoft-com:office:office" xmlns:oel="http://schemas.microsoft.com/office/2019/extlst" xmlns:r="http://schemas.openxmlformats.org/officeDocument/2006/relationships" xmlns:m="http://schemas.openxmlformats.org/officeDocument/2006/math" xmlns:v="urn:schemas-microsoft-com:vml" xmlns:wp14="http://schemas.microsoft.com/office/word/2010/wordprocessingDrawing" xmlns:wp="http://schemas.openxmlformats.org/drawingml/2006/wordprocessingDrawing" xmlns:w10="urn:schemas-microsoft-com:office:word" xmlns:w="http://schemas.openxmlformats.org/wordprocessingml/2006/main" xmlns:w14="http://schemas.microsoft.com/office/word/2010/wordml" xmlns:w15="http://schemas.microsoft.com/office/word/2012/wordml" xmlns:w16cex="http://schemas.microsoft.com/office/word/2018/wordml/cex" xmlns:w16cid="http://schemas.microsoft.com/office/word/2016/wordml/cid" xmlns:w16="http://schemas.microsoft.com/office/word/2018/wordml" xmlns:w16du="http://schemas.microsoft.com/office/word/2023/wordml/word16du" xmlns:w16sdtdh="http://schemas.microsoft.com/office/word/2020/wordml/sdtdatahash" xmlns:w16sdtfl="http://schemas.microsoft.com/office/word/2024/wordml/sdtformatlock" xmlns:w16se="http://schemas.microsoft.com/office/word/2015/wordml/symex" xmlns:wpg="http://schemas.microsoft.com/office/word/2010/wordprocessingGroup" xmlns:wpi="http://schemas.microsoft.com/office/word/2010/wordprocessingInk" xmlns:wne="http://schemas.microsoft.com/office/word/2006/wordml" xmlns:wps="http://schemas.microsoft.com/office/word/2010/wordprocessingShape" mc:Ignorable="w14 w15 w16se w16cid w16 w16cex w16sdtdh w16sdtfl w16du wp14">
+<w:ftr xmlns:wpc="http://schemas.microsoft.com/office/word/2010/wordprocessingCanvas" xmlns:cx="http://schemas.microsoft.com/office/drawing/2014/chartex" xmlns:cx1="http://schemas.microsoft.com/office/drawing/2015/9/8/chartex" xmlns:cx2="http://schemas.microsoft.com/office/drawing/2015/10/21/chartex" xmlns:cx3="http://schemas.microsoft.com/office/drawing/2016/5/9/chartex" xmlns:cx4="http://schemas.microsoft.com/office/drawing/2016/5/10/chartex" xmlns:cx5="http://schemas.microsoft.com/office/drawing/2016/5/11/chartex" xmlns:cx6="http://schemas.microsoft.com/office/drawing/2016/5/12/chartex" xmlns:cx7="http://schemas.microsoft.com/office/drawing/2016/5/13/chartex" xmlns:cx8="http://schemas.microsoft.com/office/drawing/2016/5/14/chartex" xmlns:mc="http://schemas.openxmlformats.org/markup-compatibility/2006" xmlns:m="http://schemas.openxmlformats.org/officeDocument/2006/math" xmlns:aink="http://schemas.microsoft.com/office/drawing/2016/ink" xmlns:am3d="http://schemas.microsoft.com/office/drawing/2017/model3d" xmlns:oel="http://schemas.microsoft.com/office/2019/extlst" xmlns:r="http://schemas.openxmlformats.org/officeDocument/2006/relationships" xmlns:wp14="http://schemas.microsoft.com/office/word/2010/wordprocessingDrawing" xmlns:wp="http://schemas.openxmlformats.org/drawingml/2006/wordprocessingDrawing" xmlns:wpg="http://schemas.microsoft.com/office/word/2010/wordprocessingGroup" xmlns:wpi="http://schemas.microsoft.com/office/word/2010/wordprocessingInk" xmlns:wps="http://schemas.microsoft.com/office/word/2010/wordprocessingShape" xmlns:o="urn:schemas-microsoft-com:office:office" xmlns:v="urn:schemas-microsoft-com:vml" xmlns:w10="urn:schemas-microsoft-com:office:word" xmlns:w="http://schemas.openxmlformats.org/wordprocessingml/2006/main" xmlns:w14="http://schemas.microsoft.com/office/word/2010/wordml" xmlns:w15="http://schemas.microsoft.com/office/word/2012/wordml" xmlns:w16cex="http://schemas.microsoft.com/office/word/2018/wordml/cex" xmlns:w16cid="http://schemas.microsoft.com/office/word/2016/wordml/cid" xmlns:w16="http://schemas.microsoft.com/office/word/2018/wordml" xmlns:w16sdtdh="http://schemas.microsoft.com/office/word/2020/wordml/sdtdatahash" xmlns:w16sdtfl="http://schemas.microsoft.com/office/word/2024/wordml/sdtformatlock" xmlns:w16se="http://schemas.microsoft.com/office/word/2015/wordml/symex" xmlns:w16du="http://schemas.microsoft.com/office/word/2023/wordml/word16du" xmlns:wne="http://schemas.microsoft.com/office/word/2006/wordml" mc:Ignorable="w14 w15 w16se w16cid w16 w16cex w16sdtdh w16sdtfl w16du wp14">
   <w:p>
     <w:pPr>
       <w:pStyle w:val="Pidipagina"/>
@@ -2193,7 +2280,7 @@
 </file>
 
 <file path=word/footnotes.xml><?xml version="1.0" encoding="utf-8"?>
-<w:footnotes xmlns:wpc="http://schemas.microsoft.com/office/word/2010/wordprocessingCanvas" xmlns:cx="http://schemas.microsoft.com/office/drawing/2014/chartex" xmlns:cx1="http://schemas.microsoft.com/office/drawing/2015/9/8/chartex" xmlns:cx2="http://schemas.microsoft.com/office/drawing/2015/10/21/chartex" xmlns:cx3="http://schemas.microsoft.com/office/drawing/2016/5/9/chartex" xmlns:cx4="http://schemas.microsoft.com/office/drawing/2016/5/10/chartex" xmlns:cx5="http://schemas.microsoft.com/office/drawing/2016/5/11/chartex" xmlns:cx6="http://schemas.microsoft.com/office/drawing/2016/5/12/chartex" xmlns:cx7="http://schemas.microsoft.com/office/drawing/2016/5/13/chartex" xmlns:cx8="http://schemas.microsoft.com/office/drawing/2016/5/14/chartex" xmlns:mc="http://schemas.openxmlformats.org/markup-compatibility/2006" xmlns:aink="http://schemas.microsoft.com/office/drawing/2016/ink" xmlns:am3d="http://schemas.microsoft.com/office/drawing/2017/model3d" xmlns:o="urn:schemas-microsoft-com:office:office" xmlns:oel="http://schemas.microsoft.com/office/2019/extlst" xmlns:r="http://schemas.openxmlformats.org/officeDocument/2006/relationships" xmlns:m="http://schemas.openxmlformats.org/officeDocument/2006/math" xmlns:v="urn:schemas-microsoft-com:vml" xmlns:wp14="http://schemas.microsoft.com/office/word/2010/wordprocessingDrawing" xmlns:wp="http://schemas.openxmlformats.org/drawingml/2006/wordprocessingDrawing" xmlns:w10="urn:schemas-microsoft-com:office:word" xmlns:w="http://schemas.openxmlformats.org/wordprocessingml/2006/main" xmlns:w14="http://schemas.microsoft.com/office/word/2010/wordml" xmlns:w15="http://schemas.microsoft.com/office/word/2012/wordml" xmlns:w16cex="http://schemas.microsoft.com/office/word/2018/wordml/cex" xmlns:w16cid="http://schemas.microsoft.com/office/word/2016/wordml/cid" xmlns:w16="http://schemas.microsoft.com/office/word/2018/wordml" xmlns:w16du="http://schemas.microsoft.com/office/word/2023/wordml/word16du" xmlns:w16sdtdh="http://schemas.microsoft.com/office/word/2020/wordml/sdtdatahash" xmlns:w16sdtfl="http://schemas.microsoft.com/office/word/2024/wordml/sdtformatlock" xmlns:w16se="http://schemas.microsoft.com/office/word/2015/wordml/symex" xmlns:wpg="http://schemas.microsoft.com/office/word/2010/wordprocessingGroup" xmlns:wpi="http://schemas.microsoft.com/office/word/2010/wordprocessingInk" xmlns:wne="http://schemas.microsoft.com/office/word/2006/wordml" xmlns:wps="http://schemas.microsoft.com/office/word/2010/wordprocessingShape" mc:Ignorable="w14 w15 w16se w16cid w16 w16cex w16sdtdh w16sdtfl w16du wp14">
+<w:footnotes xmlns:wpc="http://schemas.microsoft.com/office/word/2010/wordprocessingCanvas" xmlns:cx="http://schemas.microsoft.com/office/drawing/2014/chartex" xmlns:cx1="http://schemas.microsoft.com/office/drawing/2015/9/8/chartex" xmlns:cx2="http://schemas.microsoft.com/office/drawing/2015/10/21/chartex" xmlns:cx3="http://schemas.microsoft.com/office/drawing/2016/5/9/chartex" xmlns:cx4="http://schemas.microsoft.com/office/drawing/2016/5/10/chartex" xmlns:cx5="http://schemas.microsoft.com/office/drawing/2016/5/11/chartex" xmlns:cx6="http://schemas.microsoft.com/office/drawing/2016/5/12/chartex" xmlns:cx7="http://schemas.microsoft.com/office/drawing/2016/5/13/chartex" xmlns:cx8="http://schemas.microsoft.com/office/drawing/2016/5/14/chartex" xmlns:mc="http://schemas.openxmlformats.org/markup-compatibility/2006" xmlns:m="http://schemas.openxmlformats.org/officeDocument/2006/math" xmlns:aink="http://schemas.microsoft.com/office/drawing/2016/ink" xmlns:am3d="http://schemas.microsoft.com/office/drawing/2017/model3d" xmlns:oel="http://schemas.microsoft.com/office/2019/extlst" xmlns:r="http://schemas.openxmlformats.org/officeDocument/2006/relationships" xmlns:wp14="http://schemas.microsoft.com/office/word/2010/wordprocessingDrawing" xmlns:wp="http://schemas.openxmlformats.org/drawingml/2006/wordprocessingDrawing" xmlns:wpg="http://schemas.microsoft.com/office/word/2010/wordprocessingGroup" xmlns:wpi="http://schemas.microsoft.com/office/word/2010/wordprocessingInk" xmlns:wps="http://schemas.microsoft.com/office/word/2010/wordprocessingShape" xmlns:o="urn:schemas-microsoft-com:office:office" xmlns:v="urn:schemas-microsoft-com:vml" xmlns:w10="urn:schemas-microsoft-com:office:word" xmlns:w="http://schemas.openxmlformats.org/wordprocessingml/2006/main" xmlns:w14="http://schemas.microsoft.com/office/word/2010/wordml" xmlns:w15="http://schemas.microsoft.com/office/word/2012/wordml" xmlns:w16cex="http://schemas.microsoft.com/office/word/2018/wordml/cex" xmlns:w16cid="http://schemas.microsoft.com/office/word/2016/wordml/cid" xmlns:w16="http://schemas.microsoft.com/office/word/2018/wordml" xmlns:w16sdtdh="http://schemas.microsoft.com/office/word/2020/wordml/sdtdatahash" xmlns:w16sdtfl="http://schemas.microsoft.com/office/word/2024/wordml/sdtformatlock" xmlns:w16se="http://schemas.microsoft.com/office/word/2015/wordml/symex" xmlns:w16du="http://schemas.microsoft.com/office/word/2023/wordml/word16du" xmlns:wne="http://schemas.microsoft.com/office/word/2006/wordml" mc:Ignorable="w14 w15 w16se w16cid w16 w16cex w16sdtdh w16sdtfl w16du wp14">
   <w:footnote w:type="separator" w:id="-1">
     <w:p>
       <w:r>
@@ -2212,7 +2299,7 @@
 </file>
 
 <file path=word/header1.xml><?xml version="1.0" encoding="utf-8"?>
-<w:hdr xmlns:wpc="http://schemas.microsoft.com/office/word/2010/wordprocessingCanvas" xmlns:cx="http://schemas.microsoft.com/office/drawing/2014/chartex" xmlns:cx1="http://schemas.microsoft.com/office/drawing/2015/9/8/chartex" xmlns:cx2="http://schemas.microsoft.com/office/drawing/2015/10/21/chartex" xmlns:cx3="http://schemas.microsoft.com/office/drawing/2016/5/9/chartex" xmlns:cx4="http://schemas.microsoft.com/office/drawing/2016/5/10/chartex" xmlns:cx5="http://schemas.microsoft.com/office/drawing/2016/5/11/chartex" xmlns:cx6="http://schemas.microsoft.com/office/drawing/2016/5/12/chartex" xmlns:cx7="http://schemas.microsoft.com/office/drawing/2016/5/13/chartex" xmlns:cx8="http://schemas.microsoft.com/office/drawing/2016/5/14/chartex" xmlns:mc="http://schemas.openxmlformats.org/markup-compatibility/2006" xmlns:aink="http://schemas.microsoft.com/office/drawing/2016/ink" xmlns:am3d="http://schemas.microsoft.com/office/drawing/2017/model3d" xmlns:o="urn:schemas-microsoft-com:office:office" xmlns:oel="http://schemas.microsoft.com/office/2019/extlst" xmlns:r="http://schemas.openxmlformats.org/officeDocument/2006/relationships" xmlns:m="http://schemas.openxmlformats.org/officeDocument/2006/math" xmlns:v="urn:schemas-microsoft-com:vml" xmlns:wp14="http://schemas.microsoft.com/office/word/2010/wordprocessingDrawing" xmlns:wp="http://schemas.openxmlformats.org/drawingml/2006/wordprocessingDrawing" xmlns:w10="urn:schemas-microsoft-com:office:word" xmlns:w="http://schemas.openxmlformats.org/wordprocessingml/2006/main" xmlns:w14="http://schemas.microsoft.com/office/word/2010/wordml" xmlns:w15="http://schemas.microsoft.com/office/word/2012/wordml" xmlns:w16cex="http://schemas.microsoft.com/office/word/2018/wordml/cex" xmlns:w16cid="http://schemas.microsoft.com/office/word/2016/wordml/cid" xmlns:w16="http://schemas.microsoft.com/office/word/2018/wordml" xmlns:w16du="http://schemas.microsoft.com/office/word/2023/wordml/word16du" xmlns:w16sdtdh="http://schemas.microsoft.com/office/word/2020/wordml/sdtdatahash" xmlns:w16sdtfl="http://schemas.microsoft.com/office/word/2024/wordml/sdtformatlock" xmlns:w16se="http://schemas.microsoft.com/office/word/2015/wordml/symex" xmlns:wpg="http://schemas.microsoft.com/office/word/2010/wordprocessingGroup" xmlns:wpi="http://schemas.microsoft.com/office/word/2010/wordprocessingInk" xmlns:wne="http://schemas.microsoft.com/office/word/2006/wordml" xmlns:wps="http://schemas.microsoft.com/office/word/2010/wordprocessingShape" mc:Ignorable="w14 w15 w16se w16cid w16 w16cex w16sdtdh w16sdtfl w16du wp14">
+<w:hdr xmlns:wpc="http://schemas.microsoft.com/office/word/2010/wordprocessingCanvas" xmlns:cx="http://schemas.microsoft.com/office/drawing/2014/chartex" xmlns:cx1="http://schemas.microsoft.com/office/drawing/2015/9/8/chartex" xmlns:cx2="http://schemas.microsoft.com/office/drawing/2015/10/21/chartex" xmlns:cx3="http://schemas.microsoft.com/office/drawing/2016/5/9/chartex" xmlns:cx4="http://schemas.microsoft.com/office/drawing/2016/5/10/chartex" xmlns:cx5="http://schemas.microsoft.com/office/drawing/2016/5/11/chartex" xmlns:cx6="http://schemas.microsoft.com/office/drawing/2016/5/12/chartex" xmlns:cx7="http://schemas.microsoft.com/office/drawing/2016/5/13/chartex" xmlns:cx8="http://schemas.microsoft.com/office/drawing/2016/5/14/chartex" xmlns:mc="http://schemas.openxmlformats.org/markup-compatibility/2006" xmlns:m="http://schemas.openxmlformats.org/officeDocument/2006/math" xmlns:aink="http://schemas.microsoft.com/office/drawing/2016/ink" xmlns:am3d="http://schemas.microsoft.com/office/drawing/2017/model3d" xmlns:oel="http://schemas.microsoft.com/office/2019/extlst" xmlns:r="http://schemas.openxmlformats.org/officeDocument/2006/relationships" xmlns:wp14="http://schemas.microsoft.com/office/word/2010/wordprocessingDrawing" xmlns:wp="http://schemas.openxmlformats.org/drawingml/2006/wordprocessingDrawing" xmlns:wpg="http://schemas.microsoft.com/office/word/2010/wordprocessingGroup" xmlns:wpi="http://schemas.microsoft.com/office/word/2010/wordprocessingInk" xmlns:wps="http://schemas.microsoft.com/office/word/2010/wordprocessingShape" xmlns:o="urn:schemas-microsoft-com:office:office" xmlns:v="urn:schemas-microsoft-com:vml" xmlns:w10="urn:schemas-microsoft-com:office:word" xmlns:w="http://schemas.openxmlformats.org/wordprocessingml/2006/main" xmlns:w14="http://schemas.microsoft.com/office/word/2010/wordml" xmlns:w15="http://schemas.microsoft.com/office/word/2012/wordml" xmlns:w16cex="http://schemas.microsoft.com/office/word/2018/wordml/cex" xmlns:w16cid="http://schemas.microsoft.com/office/word/2016/wordml/cid" xmlns:w16="http://schemas.microsoft.com/office/word/2018/wordml" xmlns:w16sdtdh="http://schemas.microsoft.com/office/word/2020/wordml/sdtdatahash" xmlns:w16sdtfl="http://schemas.microsoft.com/office/word/2024/wordml/sdtformatlock" xmlns:w16se="http://schemas.microsoft.com/office/word/2015/wordml/symex" xmlns:w16du="http://schemas.microsoft.com/office/word/2023/wordml/word16du" xmlns:wne="http://schemas.microsoft.com/office/word/2006/wordml" mc:Ignorable="w14 w15 w16se w16cid w16 w16cex w16sdtdh w16sdtfl w16du wp14">
   <w:p>
     <w:pPr>
       <w:pStyle w:val="Intestazione"/>
@@ -2535,7 +2622,7 @@
 </file>
 
 <file path=word/numbering.xml><?xml version="1.0" encoding="utf-8"?>
-<w:numbering xmlns:wpc="http://schemas.microsoft.com/office/word/2010/wordprocessingCanvas" xmlns:cx="http://schemas.microsoft.com/office/drawing/2014/chartex" xmlns:cx1="http://schemas.microsoft.com/office/drawing/2015/9/8/chartex" xmlns:cx2="http://schemas.microsoft.com/office/drawing/2015/10/21/chartex" xmlns:cx3="http://schemas.microsoft.com/office/drawing/2016/5/9/chartex" xmlns:cx4="http://schemas.microsoft.com/office/drawing/2016/5/10/chartex" xmlns:cx5="http://schemas.microsoft.com/office/drawing/2016/5/11/chartex" xmlns:cx6="http://schemas.microsoft.com/office/drawing/2016/5/12/chartex" xmlns:cx7="http://schemas.microsoft.com/office/drawing/2016/5/13/chartex" xmlns:cx8="http://schemas.microsoft.com/office/drawing/2016/5/14/chartex" xmlns:mc="http://schemas.openxmlformats.org/markup-compatibility/2006" xmlns:aink="http://schemas.microsoft.com/office/drawing/2016/ink" xmlns:am3d="http://schemas.microsoft.com/office/drawing/2017/model3d" xmlns:o="urn:schemas-microsoft-com:office:office" xmlns:oel="http://schemas.microsoft.com/office/2019/extlst" xmlns:r="http://schemas.openxmlformats.org/officeDocument/2006/relationships" xmlns:m="http://schemas.openxmlformats.org/officeDocument/2006/math" xmlns:v="urn:schemas-microsoft-com:vml" xmlns:wp14="http://schemas.microsoft.com/office/word/2010/wordprocessingDrawing" xmlns:wp="http://schemas.openxmlformats.org/drawingml/2006/wordprocessingDrawing" xmlns:w10="urn:schemas-microsoft-com:office:word" xmlns:w="http://schemas.openxmlformats.org/wordprocessingml/2006/main" xmlns:w14="http://schemas.microsoft.com/office/word/2010/wordml" xmlns:w15="http://schemas.microsoft.com/office/word/2012/wordml" xmlns:w16cex="http://schemas.microsoft.com/office/word/2018/wordml/cex" xmlns:w16cid="http://schemas.microsoft.com/office/word/2016/wordml/cid" xmlns:w16="http://schemas.microsoft.com/office/word/2018/wordml" xmlns:w16du="http://schemas.microsoft.com/office/word/2023/wordml/word16du" xmlns:w16sdtdh="http://schemas.microsoft.com/office/word/2020/wordml/sdtdatahash" xmlns:w16sdtfl="http://schemas.microsoft.com/office/word/2024/wordml/sdtformatlock" xmlns:w16se="http://schemas.microsoft.com/office/word/2015/wordml/symex" xmlns:wpg="http://schemas.microsoft.com/office/word/2010/wordprocessingGroup" xmlns:wpi="http://schemas.microsoft.com/office/word/2010/wordprocessingInk" xmlns:wne="http://schemas.microsoft.com/office/word/2006/wordml" xmlns:wps="http://schemas.microsoft.com/office/word/2010/wordprocessingShape" mc:Ignorable="w14 w15 w16se w16cid w16 w16cex w16sdtdh w16sdtfl w16du wp14">
+<w:numbering xmlns:wpc="http://schemas.microsoft.com/office/word/2010/wordprocessingCanvas" xmlns:cx="http://schemas.microsoft.com/office/drawing/2014/chartex" xmlns:cx1="http://schemas.microsoft.com/office/drawing/2015/9/8/chartex" xmlns:cx2="http://schemas.microsoft.com/office/drawing/2015/10/21/chartex" xmlns:cx3="http://schemas.microsoft.com/office/drawing/2016/5/9/chartex" xmlns:cx4="http://schemas.microsoft.com/office/drawing/2016/5/10/chartex" xmlns:cx5="http://schemas.microsoft.com/office/drawing/2016/5/11/chartex" xmlns:cx6="http://schemas.microsoft.com/office/drawing/2016/5/12/chartex" xmlns:cx7="http://schemas.microsoft.com/office/drawing/2016/5/13/chartex" xmlns:cx8="http://schemas.microsoft.com/office/drawing/2016/5/14/chartex" xmlns:mc="http://schemas.openxmlformats.org/markup-compatibility/2006" xmlns:m="http://schemas.openxmlformats.org/officeDocument/2006/math" xmlns:aink="http://schemas.microsoft.com/office/drawing/2016/ink" xmlns:am3d="http://schemas.microsoft.com/office/drawing/2017/model3d" xmlns:oel="http://schemas.microsoft.com/office/2019/extlst" xmlns:r="http://schemas.openxmlformats.org/officeDocument/2006/relationships" xmlns:wp14="http://schemas.microsoft.com/office/word/2010/wordprocessingDrawing" xmlns:wp="http://schemas.openxmlformats.org/drawingml/2006/wordprocessingDrawing" xmlns:wpg="http://schemas.microsoft.com/office/word/2010/wordprocessingGroup" xmlns:wpi="http://schemas.microsoft.com/office/word/2010/wordprocessingInk" xmlns:wps="http://schemas.microsoft.com/office/word/2010/wordprocessingShape" xmlns:o="urn:schemas-microsoft-com:office:office" xmlns:v="urn:schemas-microsoft-com:vml" xmlns:w10="urn:schemas-microsoft-com:office:word" xmlns:w="http://schemas.openxmlformats.org/wordprocessingml/2006/main" xmlns:w14="http://schemas.microsoft.com/office/word/2010/wordml" xmlns:w15="http://schemas.microsoft.com/office/word/2012/wordml" xmlns:w16cex="http://schemas.microsoft.com/office/word/2018/wordml/cex" xmlns:w16cid="http://schemas.microsoft.com/office/word/2016/wordml/cid" xmlns:w16="http://schemas.microsoft.com/office/word/2018/wordml" xmlns:w16sdtdh="http://schemas.microsoft.com/office/word/2020/wordml/sdtdatahash" xmlns:w16sdtfl="http://schemas.microsoft.com/office/word/2024/wordml/sdtformatlock" xmlns:w16se="http://schemas.microsoft.com/office/word/2015/wordml/symex" xmlns:w16du="http://schemas.microsoft.com/office/word/2023/wordml/word16du" xmlns:wne="http://schemas.microsoft.com/office/word/2006/wordml" mc:Ignorable="w14 w15 w16se w16cid w16 w16cex w16sdtdh w16sdtfl w16du wp14">
   <w:abstractNum w:abstractNumId="0" w15:restartNumberingAfterBreak="0">
     <w:nsid w:val="5624763F"/>
     <w:multiLevelType w:val="hybridMultilevel"/>
@@ -2633,7 +2720,7 @@
 </file>
 
 <file path=word/styles.xml><?xml version="1.0" encoding="utf-8"?>
-<w:styles xmlns:mc="http://schemas.openxmlformats.org/markup-compatibility/2006" xmlns:r="http://schemas.openxmlformats.org/officeDocument/2006/relationships" xmlns:w="http://schemas.openxmlformats.org/wordprocessingml/2006/main" xmlns:w14="http://schemas.microsoft.com/office/word/2010/wordml" xmlns:w15="http://schemas.microsoft.com/office/word/2012/wordml" xmlns:w16cex="http://schemas.microsoft.com/office/word/2018/wordml/cex" xmlns:w16cid="http://schemas.microsoft.com/office/word/2016/wordml/cid" xmlns:w16="http://schemas.microsoft.com/office/word/2018/wordml" xmlns:w16du="http://schemas.microsoft.com/office/word/2023/wordml/word16du" xmlns:w16sdtdh="http://schemas.microsoft.com/office/word/2020/wordml/sdtdatahash" xmlns:w16sdtfl="http://schemas.microsoft.com/office/word/2024/wordml/sdtformatlock" xmlns:w16se="http://schemas.microsoft.com/office/word/2015/wordml/symex" mc:Ignorable="w14 w15 w16se w16cid w16 w16cex w16sdtdh w16sdtfl w16du">
+<w:styles xmlns:mc="http://schemas.openxmlformats.org/markup-compatibility/2006" xmlns:r="http://schemas.openxmlformats.org/officeDocument/2006/relationships" xmlns:w="http://schemas.openxmlformats.org/wordprocessingml/2006/main" xmlns:w14="http://schemas.microsoft.com/office/word/2010/wordml" xmlns:w15="http://schemas.microsoft.com/office/word/2012/wordml" xmlns:w16cex="http://schemas.microsoft.com/office/word/2018/wordml/cex" xmlns:w16cid="http://schemas.microsoft.com/office/word/2016/wordml/cid" xmlns:w16="http://schemas.microsoft.com/office/word/2018/wordml" xmlns:w16sdtdh="http://schemas.microsoft.com/office/word/2020/wordml/sdtdatahash" xmlns:w16sdtfl="http://schemas.microsoft.com/office/word/2024/wordml/sdtformatlock" xmlns:w16se="http://schemas.microsoft.com/office/word/2015/wordml/symex" xmlns:w16du="http://schemas.microsoft.com/office/word/2023/wordml/word16du" mc:Ignorable="w14 w15 w16se w16cid w16 w16cex w16sdtdh w16sdtfl w16du">
   <w:docDefaults>
     <w:rPrDefault>
       <w:rPr>

</xml_diff>

<commit_message>
Fix report placeholders and API delete requests
</commit_message>
<xml_diff>
--- a/src/lib/templates/template_dislip.docx
+++ b/src/lib/templates/template_dislip.docx
@@ -58,17 +58,23 @@
         <w:jc w:val="right"/>
         <w:rPr>
           <w:rFonts w:ascii="Arial" w:hAnsi="Arial" w:cs="Arial"/>
-        </w:rPr>
-      </w:pPr>
-      <w:r>
-        <w:rPr>
-          <w:rFonts w:ascii="Arial" w:hAnsi="Arial" w:cs="Arial"/>
+          <w:sz w:val="21"/>
+          <w:szCs w:val="21"/>
+        </w:rPr>
+      </w:pPr>
+      <w:r>
+        <w:rPr>
+          <w:rFonts w:ascii="Arial" w:hAnsi="Arial" w:cs="Arial"/>
+          <w:sz w:val="21"/>
+          <w:szCs w:val="21"/>
         </w:rPr>
         <w:t xml:space="preserve">Sassari, il </w:t>
       </w:r>
       <w:r>
         <w:rPr>
           <w:rFonts w:ascii="Arial" w:hAnsi="Arial" w:cs="Arial"/>
+          <w:sz w:val="21"/>
+          <w:szCs w:val="21"/>
         </w:rPr>
         <w:t>{</w:t>
       </w:r>
@@ -76,6 +82,8 @@
       <w:r>
         <w:rPr>
           <w:rFonts w:ascii="Arial" w:hAnsi="Arial" w:cs="Arial"/>
+          <w:sz w:val="21"/>
+          <w:szCs w:val="21"/>
         </w:rPr>
         <w:t>data_visita</w:t>
       </w:r>
@@ -83,6 +91,8 @@
       <w:r>
         <w:rPr>
           <w:rFonts w:ascii="Arial" w:hAnsi="Arial" w:cs="Arial"/>
+          <w:sz w:val="21"/>
+          <w:szCs w:val="21"/>
         </w:rPr>
         <w:t>}</w:t>
       </w:r>
@@ -91,26 +101,30 @@
       <w:pPr>
         <w:rPr>
           <w:rFonts w:ascii="Arial" w:hAnsi="Arial" w:cs="Arial"/>
+          <w:sz w:val="21"/>
+          <w:szCs w:val="21"/>
         </w:rPr>
       </w:pPr>
       <w:r>
         <w:rPr>
           <w:rFonts w:ascii="Arial" w:hAnsi="Arial" w:cs="Arial"/>
           <w:noProof/>
+          <w:sz w:val="21"/>
+          <w:szCs w:val="21"/>
         </w:rPr>
         <mc:AlternateContent>
           <mc:Choice Requires="wps">
             <w:drawing>
-              <wp:anchor distT="0" distB="0" distL="114300" distR="114300" simplePos="0" relativeHeight="251659264" behindDoc="1" locked="0" layoutInCell="1" allowOverlap="1" wp14:anchorId="6BEE0F52" wp14:editId="671C07AD">
+              <wp:anchor distT="0" distB="0" distL="114300" distR="114300" simplePos="0" relativeHeight="251659264" behindDoc="1" locked="0" layoutInCell="1" allowOverlap="1" wp14:anchorId="6BEE0F52" wp14:editId="1C35A3D2">
                 <wp:simplePos x="0" y="0"/>
                 <wp:positionH relativeFrom="column">
-                  <wp:posOffset>-99060</wp:posOffset>
+                  <wp:posOffset>-100965</wp:posOffset>
                 </wp:positionH>
                 <wp:positionV relativeFrom="paragraph">
-                  <wp:posOffset>140970</wp:posOffset>
+                  <wp:posOffset>120015</wp:posOffset>
                 </wp:positionV>
-                <wp:extent cx="6241409" cy="1283515"/>
-                <wp:effectExtent l="0" t="0" r="7620" b="12065"/>
+                <wp:extent cx="6241409" cy="1114425"/>
+                <wp:effectExtent l="0" t="0" r="7620" b="15875"/>
                 <wp:wrapNone/>
                 <wp:docPr id="1994433842" name="Casella di testo 6"/>
                 <wp:cNvGraphicFramePr/>
@@ -121,7 +135,7 @@
                       <wps:spPr>
                         <a:xfrm>
                           <a:off x="0" y="0"/>
-                          <a:ext cx="6241409" cy="1283515"/>
+                          <a:ext cx="6241409" cy="1114425"/>
                         </a:xfrm>
                         <a:prstGeom prst="rect">
                           <a:avLst/>
@@ -149,6 +163,9 @@
                     </wps:wsp>
                   </a:graphicData>
                 </a:graphic>
+                <wp14:sizeRelV relativeFrom="margin">
+                  <wp14:pctHeight>0</wp14:pctHeight>
+                </wp14:sizeRelV>
               </wp:anchor>
             </w:drawing>
           </mc:Choice>
@@ -158,7 +175,7 @@
                 <v:stroke joinstyle="miter"/>
                 <v:path gradientshapeok="t" o:connecttype="rect"/>
               </v:shapetype>
-              <v:shape id="Casella di testo 6" o:spid="_x0000_s1026" type="#_x0000_t202" style="position:absolute;margin-left:-7.8pt;margin-top:11.1pt;width:491.45pt;height:101.05pt;z-index:-251657216;visibility:visible;mso-wrap-style:square;mso-wrap-distance-left:9pt;mso-wrap-distance-top:0;mso-wrap-distance-right:9pt;mso-wrap-distance-bottom:0;mso-position-horizontal:absolute;mso-position-horizontal-relative:text;mso-position-vertical:absolute;mso-position-vertical-relative:text;v-text-anchor:top" o:gfxdata="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" fillcolor="#e8e8e8 [3214]" strokeweight=".5pt">
+              <v:shape id="Casella di testo 6" o:spid="_x0000_s1026" type="#_x0000_t202" style="position:absolute;margin-left:-7.95pt;margin-top:9.45pt;width:491.45pt;height:87.75pt;z-index:-251657216;visibility:visible;mso-wrap-style:square;mso-height-percent:0;mso-wrap-distance-left:9pt;mso-wrap-distance-top:0;mso-wrap-distance-right:9pt;mso-wrap-distance-bottom:0;mso-position-horizontal:absolute;mso-position-horizontal-relative:text;mso-position-vertical:absolute;mso-position-vertical-relative:text;mso-height-percent:0;mso-height-relative:margin;v-text-anchor:top" o:gfxdata="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" fillcolor="#e8e8e8 [3214]" strokeweight=".5pt">
                 <v:textbox>
                   <w:txbxContent>
                     <w:p/>
@@ -175,11 +192,15 @@
         <w:spacing w:line="276" w:lineRule="auto"/>
         <w:rPr>
           <w:rFonts w:ascii="Arial" w:hAnsi="Arial" w:cs="Arial"/>
-        </w:rPr>
-      </w:pPr>
-      <w:r>
-        <w:rPr>
-          <w:rFonts w:ascii="Arial" w:hAnsi="Arial" w:cs="Arial"/>
+          <w:sz w:val="21"/>
+          <w:szCs w:val="21"/>
+        </w:rPr>
+      </w:pPr>
+      <w:r>
+        <w:rPr>
+          <w:rFonts w:ascii="Arial" w:hAnsi="Arial" w:cs="Arial"/>
+          <w:sz w:val="21"/>
+          <w:szCs w:val="21"/>
         </w:rPr>
         <w:t xml:space="preserve">Nome: </w:t>
       </w:r>
@@ -188,12 +209,16 @@
           <w:rFonts w:ascii="Arial" w:hAnsi="Arial" w:cs="Arial"/>
           <w:b/>
           <w:bCs/>
+          <w:sz w:val="21"/>
+          <w:szCs w:val="21"/>
         </w:rPr>
         <w:t>{nome}</w:t>
       </w:r>
       <w:r>
         <w:rPr>
           <w:rFonts w:ascii="Arial" w:hAnsi="Arial" w:cs="Arial"/>
+          <w:sz w:val="21"/>
+          <w:szCs w:val="21"/>
         </w:rPr>
         <w:t xml:space="preserve"> </w:t>
       </w:r>
@@ -202,12 +227,16 @@
           <w:rFonts w:ascii="Arial" w:hAnsi="Arial" w:cs="Arial"/>
           <w:b/>
           <w:bCs/>
+          <w:sz w:val="21"/>
+          <w:szCs w:val="21"/>
         </w:rPr>
         <w:t>{cognome}</w:t>
       </w:r>
       <w:r>
         <w:rPr>
           <w:rFonts w:ascii="Arial" w:hAnsi="Arial" w:cs="Arial"/>
+          <w:sz w:val="21"/>
+          <w:szCs w:val="21"/>
         </w:rPr>
         <w:t>;</w:t>
       </w:r>
@@ -217,11 +246,15 @@
         <w:spacing w:line="276" w:lineRule="auto"/>
         <w:rPr>
           <w:rFonts w:ascii="Arial" w:hAnsi="Arial" w:cs="Arial"/>
-        </w:rPr>
-      </w:pPr>
-      <w:r>
-        <w:rPr>
-          <w:rFonts w:ascii="Arial" w:hAnsi="Arial" w:cs="Arial"/>
+          <w:sz w:val="21"/>
+          <w:szCs w:val="21"/>
+        </w:rPr>
+      </w:pPr>
+      <w:r>
+        <w:rPr>
+          <w:rFonts w:ascii="Arial" w:hAnsi="Arial" w:cs="Arial"/>
+          <w:sz w:val="21"/>
+          <w:szCs w:val="21"/>
         </w:rPr>
         <w:t>{</w:t>
       </w:r>
@@ -229,6 +262,8 @@
       <w:r>
         <w:rPr>
           <w:rFonts w:ascii="Arial" w:hAnsi="Arial" w:cs="Arial"/>
+          <w:sz w:val="21"/>
+          <w:szCs w:val="21"/>
         </w:rPr>
         <w:t>nato_nata</w:t>
       </w:r>
@@ -236,12 +271,16 @@
       <w:r>
         <w:rPr>
           <w:rFonts w:ascii="Arial" w:hAnsi="Arial" w:cs="Arial"/>
+          <w:sz w:val="21"/>
+          <w:szCs w:val="21"/>
         </w:rPr>
         <w:t>}</w:t>
       </w:r>
       <w:r>
         <w:rPr>
           <w:rFonts w:ascii="Arial" w:hAnsi="Arial" w:cs="Arial"/>
+          <w:sz w:val="21"/>
+          <w:szCs w:val="21"/>
         </w:rPr>
         <w:t xml:space="preserve"> a {</w:t>
       </w:r>
@@ -249,6 +288,8 @@
       <w:r>
         <w:rPr>
           <w:rFonts w:ascii="Arial" w:hAnsi="Arial" w:cs="Arial"/>
+          <w:sz w:val="21"/>
+          <w:szCs w:val="21"/>
         </w:rPr>
         <w:t>comune_nascita</w:t>
       </w:r>
@@ -256,6 +297,8 @@
       <w:r>
         <w:rPr>
           <w:rFonts w:ascii="Arial" w:hAnsi="Arial" w:cs="Arial"/>
+          <w:sz w:val="21"/>
+          <w:szCs w:val="21"/>
         </w:rPr>
         <w:t>} il {</w:t>
       </w:r>
@@ -263,6 +306,8 @@
       <w:r>
         <w:rPr>
           <w:rFonts w:ascii="Arial" w:hAnsi="Arial" w:cs="Arial"/>
+          <w:sz w:val="21"/>
+          <w:szCs w:val="21"/>
         </w:rPr>
         <w:t>data_nascita</w:t>
       </w:r>
@@ -270,6 +315,8 @@
       <w:r>
         <w:rPr>
           <w:rFonts w:ascii="Arial" w:hAnsi="Arial" w:cs="Arial"/>
+          <w:sz w:val="21"/>
+          <w:szCs w:val="21"/>
         </w:rPr>
         <w:t>};</w:t>
       </w:r>
@@ -279,11 +326,15 @@
         <w:spacing w:line="276" w:lineRule="auto"/>
         <w:rPr>
           <w:rFonts w:ascii="Arial" w:hAnsi="Arial" w:cs="Arial"/>
-        </w:rPr>
-      </w:pPr>
-      <w:r>
-        <w:rPr>
-          <w:rFonts w:ascii="Arial" w:hAnsi="Arial" w:cs="Arial"/>
+          <w:sz w:val="21"/>
+          <w:szCs w:val="21"/>
+        </w:rPr>
+      </w:pPr>
+      <w:r>
+        <w:rPr>
+          <w:rFonts w:ascii="Arial" w:hAnsi="Arial" w:cs="Arial"/>
+          <w:sz w:val="21"/>
+          <w:szCs w:val="21"/>
         </w:rPr>
         <w:t>Codice fiscale: {</w:t>
       </w:r>
@@ -291,6 +342,8 @@
       <w:r>
         <w:rPr>
           <w:rFonts w:ascii="Arial" w:hAnsi="Arial" w:cs="Arial"/>
+          <w:sz w:val="21"/>
+          <w:szCs w:val="21"/>
         </w:rPr>
         <w:t>codice_fiscale</w:t>
       </w:r>
@@ -298,6 +351,8 @@
       <w:r>
         <w:rPr>
           <w:rFonts w:ascii="Arial" w:hAnsi="Arial" w:cs="Arial"/>
+          <w:sz w:val="21"/>
+          <w:szCs w:val="21"/>
         </w:rPr>
         <w:t>};</w:t>
       </w:r>
@@ -307,47 +362,63 @@
         <w:spacing w:line="276" w:lineRule="auto"/>
         <w:rPr>
           <w:rFonts w:ascii="Arial" w:hAnsi="Arial" w:cs="Arial"/>
-        </w:rPr>
-      </w:pPr>
-      <w:r>
-        <w:rPr>
-          <w:rFonts w:ascii="Arial" w:hAnsi="Arial" w:cs="Arial"/>
+          <w:sz w:val="21"/>
+          <w:szCs w:val="21"/>
+        </w:rPr>
+      </w:pPr>
+      <w:r>
+        <w:rPr>
+          <w:rFonts w:ascii="Arial" w:hAnsi="Arial" w:cs="Arial"/>
+          <w:sz w:val="21"/>
+          <w:szCs w:val="21"/>
         </w:rPr>
         <w:t>Telefono: {telefono};</w:t>
       </w:r>
       <w:r>
         <w:rPr>
           <w:rFonts w:ascii="Arial" w:hAnsi="Arial" w:cs="Arial"/>
+          <w:sz w:val="21"/>
+          <w:szCs w:val="21"/>
         </w:rPr>
         <w:tab/>
       </w:r>
       <w:r>
         <w:rPr>
           <w:rFonts w:ascii="Arial" w:hAnsi="Arial" w:cs="Arial"/>
+          <w:sz w:val="21"/>
+          <w:szCs w:val="21"/>
         </w:rPr>
         <w:tab/>
       </w:r>
       <w:r>
         <w:rPr>
           <w:rFonts w:ascii="Arial" w:hAnsi="Arial" w:cs="Arial"/>
+          <w:sz w:val="21"/>
+          <w:szCs w:val="21"/>
         </w:rPr>
         <w:tab/>
       </w:r>
       <w:r>
         <w:rPr>
           <w:rFonts w:ascii="Arial" w:hAnsi="Arial" w:cs="Arial"/>
+          <w:sz w:val="21"/>
+          <w:szCs w:val="21"/>
         </w:rPr>
         <w:tab/>
       </w:r>
       <w:r>
         <w:rPr>
           <w:rFonts w:ascii="Arial" w:hAnsi="Arial" w:cs="Arial"/>
+          <w:sz w:val="21"/>
+          <w:szCs w:val="21"/>
         </w:rPr>
         <w:tab/>
       </w:r>
       <w:r>
         <w:rPr>
           <w:rFonts w:ascii="Arial" w:hAnsi="Arial" w:cs="Arial"/>
+          <w:sz w:val="21"/>
+          <w:szCs w:val="21"/>
         </w:rPr>
         <w:tab/>
         <w:t>Esenzione: {esenzione}</w:t>
@@ -358,35 +429,47 @@
         <w:spacing w:line="276" w:lineRule="auto"/>
         <w:rPr>
           <w:rFonts w:ascii="Arial" w:hAnsi="Arial" w:cs="Arial"/>
-        </w:rPr>
-      </w:pPr>
-      <w:r>
-        <w:rPr>
-          <w:rFonts w:ascii="Arial" w:hAnsi="Arial" w:cs="Arial"/>
+          <w:sz w:val="21"/>
+          <w:szCs w:val="21"/>
+        </w:rPr>
+      </w:pPr>
+      <w:r>
+        <w:rPr>
+          <w:rFonts w:ascii="Arial" w:hAnsi="Arial" w:cs="Arial"/>
+          <w:sz w:val="21"/>
+          <w:szCs w:val="21"/>
         </w:rPr>
         <w:t>Peso: {peso} Kg</w:t>
       </w:r>
       <w:r>
         <w:rPr>
           <w:rFonts w:ascii="Arial" w:hAnsi="Arial" w:cs="Arial"/>
+          <w:sz w:val="21"/>
+          <w:szCs w:val="21"/>
         </w:rPr>
         <w:t>;</w:t>
       </w:r>
       <w:r>
         <w:rPr>
           <w:rFonts w:ascii="Arial" w:hAnsi="Arial" w:cs="Arial"/>
+          <w:sz w:val="21"/>
+          <w:szCs w:val="21"/>
         </w:rPr>
         <w:t xml:space="preserve"> Altezza: {altezza} cm</w:t>
       </w:r>
       <w:r>
         <w:rPr>
           <w:rFonts w:ascii="Arial" w:hAnsi="Arial" w:cs="Arial"/>
+          <w:sz w:val="21"/>
+          <w:szCs w:val="21"/>
         </w:rPr>
         <w:t>;</w:t>
       </w:r>
       <w:r>
         <w:rPr>
           <w:rFonts w:ascii="Arial" w:hAnsi="Arial" w:cs="Arial"/>
+          <w:sz w:val="21"/>
+          <w:szCs w:val="21"/>
         </w:rPr>
         <w:t xml:space="preserve"> BMI: {</w:t>
       </w:r>
@@ -394,6 +477,8 @@
       <w:r>
         <w:rPr>
           <w:rFonts w:ascii="Arial" w:hAnsi="Arial" w:cs="Arial"/>
+          <w:sz w:val="21"/>
+          <w:szCs w:val="21"/>
         </w:rPr>
         <w:t>bmi</w:t>
       </w:r>
@@ -401,18 +486,24 @@
       <w:r>
         <w:rPr>
           <w:rFonts w:ascii="Arial" w:hAnsi="Arial" w:cs="Arial"/>
+          <w:sz w:val="21"/>
+          <w:szCs w:val="21"/>
         </w:rPr>
         <w:t>}</w:t>
       </w:r>
       <w:r>
         <w:rPr>
           <w:rFonts w:ascii="Arial" w:hAnsi="Arial" w:cs="Arial"/>
+          <w:sz w:val="21"/>
+          <w:szCs w:val="21"/>
         </w:rPr>
         <w:t xml:space="preserve"> Kg/m</w:t>
       </w:r>
       <w:r>
         <w:rPr>
           <w:rFonts w:ascii="Arial" w:hAnsi="Arial" w:cs="Arial"/>
+          <w:sz w:val="21"/>
+          <w:szCs w:val="21"/>
           <w:vertAlign w:val="superscript"/>
         </w:rPr>
         <w:t>2</w:t>
@@ -420,6 +511,8 @@
       <w:r>
         <w:rPr>
           <w:rFonts w:ascii="Arial" w:hAnsi="Arial" w:cs="Arial"/>
+          <w:sz w:val="21"/>
+          <w:szCs w:val="21"/>
         </w:rPr>
         <w:t>;</w:t>
       </w:r>
@@ -429,11 +522,15 @@
         <w:spacing w:line="276" w:lineRule="auto"/>
         <w:rPr>
           <w:rFonts w:ascii="Arial" w:hAnsi="Arial" w:cs="Arial"/>
-        </w:rPr>
-      </w:pPr>
-      <w:r>
-        <w:rPr>
-          <w:rFonts w:ascii="Arial" w:hAnsi="Arial" w:cs="Arial"/>
+          <w:sz w:val="21"/>
+          <w:szCs w:val="21"/>
+        </w:rPr>
+      </w:pPr>
+      <w:r>
+        <w:rPr>
+          <w:rFonts w:ascii="Arial" w:hAnsi="Arial" w:cs="Arial"/>
+          <w:sz w:val="21"/>
+          <w:szCs w:val="21"/>
         </w:rPr>
         <w:t>Tipo visita: {</w:t>
       </w:r>
@@ -441,6 +538,8 @@
       <w:r>
         <w:rPr>
           <w:rFonts w:ascii="Arial" w:hAnsi="Arial" w:cs="Arial"/>
+          <w:sz w:val="21"/>
+          <w:szCs w:val="21"/>
         </w:rPr>
         <w:t>tipo_visita</w:t>
       </w:r>
@@ -448,18 +547,24 @@
       <w:r>
         <w:rPr>
           <w:rFonts w:ascii="Arial" w:hAnsi="Arial" w:cs="Arial"/>
+          <w:sz w:val="21"/>
+          <w:szCs w:val="21"/>
         </w:rPr>
         <w:t>}</w:t>
       </w:r>
       <w:r>
         <w:rPr>
           <w:rFonts w:ascii="Arial" w:hAnsi="Arial" w:cs="Arial"/>
+          <w:sz w:val="21"/>
+          <w:szCs w:val="21"/>
         </w:rPr>
         <w:tab/>
       </w:r>
       <w:r>
         <w:rPr>
           <w:rFonts w:ascii="Arial" w:hAnsi="Arial" w:cs="Arial"/>
+          <w:sz w:val="21"/>
+          <w:szCs w:val="21"/>
         </w:rPr>
         <w:tab/>
         <w:t>Motivo: {</w:t>
@@ -468,6 +573,8 @@
       <w:r>
         <w:rPr>
           <w:rFonts w:ascii="Arial" w:hAnsi="Arial" w:cs="Arial"/>
+          <w:sz w:val="21"/>
+          <w:szCs w:val="21"/>
         </w:rPr>
         <w:t>motivo_visita</w:t>
       </w:r>
@@ -475,6 +582,8 @@
       <w:r>
         <w:rPr>
           <w:rFonts w:ascii="Arial" w:hAnsi="Arial" w:cs="Arial"/>
+          <w:sz w:val="21"/>
+          <w:szCs w:val="21"/>
         </w:rPr>
         <w:t>}</w:t>
       </w:r>
@@ -484,6 +593,8 @@
         <w:spacing w:line="276" w:lineRule="auto"/>
         <w:rPr>
           <w:rFonts w:ascii="Arial" w:hAnsi="Arial" w:cs="Arial"/>
+          <w:sz w:val="21"/>
+          <w:szCs w:val="21"/>
         </w:rPr>
       </w:pPr>
     </w:p>
@@ -494,6 +605,8 @@
           <w:rFonts w:ascii="Arial" w:hAnsi="Arial" w:cs="Arial"/>
           <w:b/>
           <w:bCs/>
+          <w:sz w:val="21"/>
+          <w:szCs w:val="21"/>
         </w:rPr>
       </w:pPr>
       <w:r>
@@ -501,6 +614,8 @@
           <w:rFonts w:ascii="Arial" w:hAnsi="Arial" w:cs="Arial"/>
           <w:b/>
           <w:bCs/>
+          <w:sz w:val="21"/>
+          <w:szCs w:val="21"/>
         </w:rPr>
         <w:t>Anamnesi</w:t>
       </w:r>
@@ -510,11 +625,15 @@
         <w:spacing w:line="276" w:lineRule="auto"/>
         <w:rPr>
           <w:rFonts w:ascii="Arial" w:hAnsi="Arial" w:cs="Arial"/>
-        </w:rPr>
-      </w:pPr>
-      <w:r>
-        <w:rPr>
-          <w:rFonts w:ascii="Arial" w:hAnsi="Arial" w:cs="Arial"/>
+          <w:sz w:val="21"/>
+          <w:szCs w:val="21"/>
+        </w:rPr>
+      </w:pPr>
+      <w:r>
+        <w:rPr>
+          <w:rFonts w:ascii="Arial" w:hAnsi="Arial" w:cs="Arial"/>
+          <w:sz w:val="21"/>
+          <w:szCs w:val="21"/>
         </w:rPr>
         <w:t>{</w:t>
       </w:r>
@@ -522,6 +641,8 @@
       <w:r>
         <w:rPr>
           <w:rFonts w:ascii="Arial" w:hAnsi="Arial" w:cs="Arial"/>
+          <w:sz w:val="21"/>
+          <w:szCs w:val="21"/>
         </w:rPr>
         <w:t>hfdrcv</w:t>
       </w:r>
@@ -529,12 +650,16 @@
       <w:r>
         <w:rPr>
           <w:rFonts w:ascii="Arial" w:hAnsi="Arial" w:cs="Arial"/>
+          <w:sz w:val="21"/>
+          <w:szCs w:val="21"/>
         </w:rPr>
         <w:t>}</w:t>
       </w:r>
       <w:r>
         <w:rPr>
           <w:rFonts w:ascii="Arial" w:hAnsi="Arial" w:cs="Arial"/>
+          <w:sz w:val="21"/>
+          <w:szCs w:val="21"/>
         </w:rPr>
         <w:t xml:space="preserve"> {</w:t>
       </w:r>
@@ -542,6 +667,8 @@
       <w:r>
         <w:rPr>
           <w:rFonts w:ascii="Arial" w:hAnsi="Arial" w:cs="Arial"/>
+          <w:sz w:val="21"/>
+          <w:szCs w:val="21"/>
         </w:rPr>
         <w:t>fdrcv</w:t>
       </w:r>
@@ -549,6 +676,8 @@
       <w:r>
         <w:rPr>
           <w:rFonts w:ascii="Arial" w:hAnsi="Arial" w:cs="Arial"/>
+          <w:sz w:val="21"/>
+          <w:szCs w:val="21"/>
         </w:rPr>
         <w:t>}</w:t>
       </w:r>
@@ -558,11 +687,15 @@
         <w:spacing w:line="276" w:lineRule="auto"/>
         <w:rPr>
           <w:rFonts w:ascii="Arial" w:hAnsi="Arial" w:cs="Arial"/>
-        </w:rPr>
-      </w:pPr>
-      <w:r>
-        <w:rPr>
-          <w:rFonts w:ascii="Arial" w:hAnsi="Arial" w:cs="Arial"/>
+          <w:sz w:val="21"/>
+          <w:szCs w:val="21"/>
+        </w:rPr>
+      </w:pPr>
+      <w:r>
+        <w:rPr>
+          <w:rFonts w:ascii="Arial" w:hAnsi="Arial" w:cs="Arial"/>
+          <w:sz w:val="21"/>
+          <w:szCs w:val="21"/>
         </w:rPr>
         <w:t>{</w:t>
       </w:r>
@@ -570,6 +703,8 @@
       <w:r>
         <w:rPr>
           <w:rFonts w:ascii="Arial" w:hAnsi="Arial" w:cs="Arial"/>
+          <w:sz w:val="21"/>
+          <w:szCs w:val="21"/>
         </w:rPr>
         <w:t>ipercol</w:t>
       </w:r>
@@ -577,6 +712,8 @@
       <w:r>
         <w:rPr>
           <w:rFonts w:ascii="Arial" w:hAnsi="Arial" w:cs="Arial"/>
+          <w:sz w:val="21"/>
+          <w:szCs w:val="21"/>
         </w:rPr>
         <w:t>} {</w:t>
       </w:r>
@@ -584,6 +721,8 @@
       <w:r>
         <w:rPr>
           <w:rFonts w:ascii="Arial" w:hAnsi="Arial" w:cs="Arial"/>
+          <w:sz w:val="21"/>
+          <w:szCs w:val="21"/>
         </w:rPr>
         <w:t>ipercol_score</w:t>
       </w:r>
@@ -591,6 +730,8 @@
       <w:r>
         <w:rPr>
           <w:rFonts w:ascii="Arial" w:hAnsi="Arial" w:cs="Arial"/>
+          <w:sz w:val="21"/>
+          <w:szCs w:val="21"/>
         </w:rPr>
         <w:t>}</w:t>
       </w:r>
@@ -600,11 +741,15 @@
         <w:spacing w:line="276" w:lineRule="auto"/>
         <w:rPr>
           <w:rFonts w:ascii="Arial" w:hAnsi="Arial" w:cs="Arial"/>
-        </w:rPr>
-      </w:pPr>
-      <w:r>
-        <w:rPr>
-          <w:rFonts w:ascii="Arial" w:hAnsi="Arial" w:cs="Arial"/>
+          <w:sz w:val="21"/>
+          <w:szCs w:val="21"/>
+        </w:rPr>
+      </w:pPr>
+      <w:r>
+        <w:rPr>
+          <w:rFonts w:ascii="Arial" w:hAnsi="Arial" w:cs="Arial"/>
+          <w:sz w:val="21"/>
+          <w:szCs w:val="21"/>
         </w:rPr>
         <w:t>{</w:t>
       </w:r>
@@ -612,6 +757,8 @@
       <w:r>
         <w:rPr>
           <w:rFonts w:ascii="Arial" w:hAnsi="Arial" w:cs="Arial"/>
+          <w:sz w:val="21"/>
+          <w:szCs w:val="21"/>
         </w:rPr>
         <w:t>hapr</w:t>
       </w:r>
@@ -619,6 +766,8 @@
       <w:r>
         <w:rPr>
           <w:rFonts w:ascii="Arial" w:hAnsi="Arial" w:cs="Arial"/>
+          <w:sz w:val="21"/>
+          <w:szCs w:val="21"/>
         </w:rPr>
         <w:t>} {</w:t>
       </w:r>
@@ -626,6 +775,8 @@
       <w:r>
         <w:rPr>
           <w:rFonts w:ascii="Arial" w:hAnsi="Arial" w:cs="Arial"/>
+          <w:sz w:val="21"/>
+          <w:szCs w:val="21"/>
         </w:rPr>
         <w:t>apr</w:t>
       </w:r>
@@ -633,6 +784,8 @@
       <w:r>
         <w:rPr>
           <w:rFonts w:ascii="Arial" w:hAnsi="Arial" w:cs="Arial"/>
+          <w:sz w:val="21"/>
+          <w:szCs w:val="21"/>
         </w:rPr>
         <w:t>}</w:t>
       </w:r>
@@ -642,6 +795,8 @@
         <w:spacing w:line="276" w:lineRule="auto"/>
         <w:rPr>
           <w:rFonts w:ascii="Arial" w:hAnsi="Arial" w:cs="Arial"/>
+          <w:sz w:val="21"/>
+          <w:szCs w:val="21"/>
         </w:rPr>
       </w:pPr>
     </w:p>
@@ -652,6 +807,8 @@
           <w:rFonts w:ascii="Arial" w:hAnsi="Arial" w:cs="Arial"/>
           <w:b/>
           <w:bCs/>
+          <w:sz w:val="21"/>
+          <w:szCs w:val="21"/>
         </w:rPr>
       </w:pPr>
       <w:r>
@@ -659,6 +816,8 @@
           <w:rFonts w:ascii="Arial" w:hAnsi="Arial" w:cs="Arial"/>
           <w:b/>
           <w:bCs/>
+          <w:sz w:val="21"/>
+          <w:szCs w:val="21"/>
         </w:rPr>
         <w:t>Terapia domiciliare</w:t>
       </w:r>
@@ -668,11 +827,15 @@
         <w:spacing w:line="276" w:lineRule="auto"/>
         <w:rPr>
           <w:rFonts w:ascii="Arial" w:hAnsi="Arial" w:cs="Arial"/>
-        </w:rPr>
-      </w:pPr>
-      <w:r>
-        <w:rPr>
-          <w:rFonts w:ascii="Arial" w:hAnsi="Arial" w:cs="Arial"/>
+          <w:sz w:val="21"/>
+          <w:szCs w:val="21"/>
+        </w:rPr>
+      </w:pPr>
+      <w:r>
+        <w:rPr>
+          <w:rFonts w:ascii="Arial" w:hAnsi="Arial" w:cs="Arial"/>
+          <w:sz w:val="21"/>
+          <w:szCs w:val="21"/>
         </w:rPr>
         <w:t>{</w:t>
       </w:r>
@@ -680,6 +843,8 @@
       <w:r>
         <w:rPr>
           <w:rFonts w:ascii="Arial" w:hAnsi="Arial" w:cs="Arial"/>
+          <w:sz w:val="21"/>
+          <w:szCs w:val="21"/>
         </w:rPr>
         <w:t>htpipo</w:t>
       </w:r>
@@ -687,12 +852,16 @@
       <w:r>
         <w:rPr>
           <w:rFonts w:ascii="Arial" w:hAnsi="Arial" w:cs="Arial"/>
+          <w:sz w:val="21"/>
+          <w:szCs w:val="21"/>
         </w:rPr>
         <w:t>}</w:t>
       </w:r>
       <w:r>
         <w:rPr>
           <w:rFonts w:ascii="Arial" w:hAnsi="Arial" w:cs="Arial"/>
+          <w:sz w:val="21"/>
+          <w:szCs w:val="21"/>
         </w:rPr>
         <w:t xml:space="preserve"> {</w:t>
       </w:r>
@@ -700,6 +869,8 @@
       <w:r>
         <w:rPr>
           <w:rFonts w:ascii="Arial" w:hAnsi="Arial" w:cs="Arial"/>
+          <w:sz w:val="21"/>
+          <w:szCs w:val="21"/>
         </w:rPr>
         <w:t>tpipo</w:t>
       </w:r>
@@ -707,6 +878,8 @@
       <w:r>
         <w:rPr>
           <w:rFonts w:ascii="Arial" w:hAnsi="Arial" w:cs="Arial"/>
+          <w:sz w:val="21"/>
+          <w:szCs w:val="21"/>
         </w:rPr>
         <w:t>}</w:t>
       </w:r>
@@ -716,11 +889,15 @@
         <w:spacing w:line="276" w:lineRule="auto"/>
         <w:rPr>
           <w:rFonts w:ascii="Arial" w:hAnsi="Arial" w:cs="Arial"/>
-        </w:rPr>
-      </w:pPr>
-      <w:r>
-        <w:rPr>
-          <w:rFonts w:ascii="Arial" w:hAnsi="Arial" w:cs="Arial"/>
+          <w:sz w:val="21"/>
+          <w:szCs w:val="21"/>
+        </w:rPr>
+      </w:pPr>
+      <w:r>
+        <w:rPr>
+          <w:rFonts w:ascii="Arial" w:hAnsi="Arial" w:cs="Arial"/>
+          <w:sz w:val="21"/>
+          <w:szCs w:val="21"/>
         </w:rPr>
         <w:t>{</w:t>
       </w:r>
@@ -728,6 +905,8 @@
       <w:r>
         <w:rPr>
           <w:rFonts w:ascii="Arial" w:hAnsi="Arial" w:cs="Arial"/>
+          <w:sz w:val="21"/>
+          <w:szCs w:val="21"/>
         </w:rPr>
         <w:t>hresttp</w:t>
       </w:r>
@@ -735,6 +914,8 @@
       <w:r>
         <w:rPr>
           <w:rFonts w:ascii="Arial" w:hAnsi="Arial" w:cs="Arial"/>
+          <w:sz w:val="21"/>
+          <w:szCs w:val="21"/>
         </w:rPr>
         <w:t>} {</w:t>
       </w:r>
@@ -742,6 +923,8 @@
       <w:r>
         <w:rPr>
           <w:rFonts w:ascii="Arial" w:hAnsi="Arial" w:cs="Arial"/>
+          <w:sz w:val="21"/>
+          <w:szCs w:val="21"/>
         </w:rPr>
         <w:t>resttp</w:t>
       </w:r>
@@ -749,6 +932,8 @@
       <w:r>
         <w:rPr>
           <w:rFonts w:ascii="Arial" w:hAnsi="Arial" w:cs="Arial"/>
+          <w:sz w:val="21"/>
+          <w:szCs w:val="21"/>
         </w:rPr>
         <w:t>}</w:t>
       </w:r>
@@ -758,6 +943,8 @@
         <w:spacing w:line="276" w:lineRule="auto"/>
         <w:rPr>
           <w:rFonts w:ascii="Arial" w:hAnsi="Arial" w:cs="Arial"/>
+          <w:sz w:val="21"/>
+          <w:szCs w:val="21"/>
         </w:rPr>
       </w:pPr>
     </w:p>
@@ -768,6 +955,8 @@
           <w:rFonts w:ascii="Arial" w:hAnsi="Arial" w:cs="Arial"/>
           <w:b/>
           <w:bCs/>
+          <w:sz w:val="21"/>
+          <w:szCs w:val="21"/>
         </w:rPr>
       </w:pPr>
       <w:r>
@@ -775,6 +964,8 @@
           <w:rFonts w:ascii="Arial" w:hAnsi="Arial" w:cs="Arial"/>
           <w:b/>
           <w:bCs/>
+          <w:sz w:val="21"/>
+          <w:szCs w:val="21"/>
         </w:rPr>
         <w:t>Valutazione odierna</w:t>
       </w:r>
@@ -784,11 +975,15 @@
         <w:spacing w:line="276" w:lineRule="auto"/>
         <w:rPr>
           <w:rFonts w:ascii="Arial" w:hAnsi="Arial" w:cs="Arial"/>
-        </w:rPr>
-      </w:pPr>
-      <w:r>
-        <w:rPr>
-          <w:rFonts w:ascii="Arial" w:hAnsi="Arial" w:cs="Arial"/>
+          <w:sz w:val="21"/>
+          <w:szCs w:val="21"/>
+        </w:rPr>
+      </w:pPr>
+      <w:r>
+        <w:rPr>
+          <w:rFonts w:ascii="Arial" w:hAnsi="Arial" w:cs="Arial"/>
+          <w:sz w:val="21"/>
+          <w:szCs w:val="21"/>
         </w:rPr>
         <w:t>{valutazione_odierna}</w:t>
       </w:r>
@@ -800,6 +995,8 @@
           <w:rFonts w:ascii="Arial" w:hAnsi="Arial" w:cs="Arial"/>
           <w:b/>
           <w:bCs/>
+          <w:sz w:val="21"/>
+          <w:szCs w:val="21"/>
         </w:rPr>
       </w:pPr>
     </w:p>
@@ -810,6 +1007,8 @@
           <w:rFonts w:ascii="Arial" w:hAnsi="Arial" w:cs="Arial"/>
           <w:b/>
           <w:bCs/>
+          <w:sz w:val="21"/>
+          <w:szCs w:val="21"/>
         </w:rPr>
       </w:pPr>
       <w:r>
@@ -817,6 +1016,8 @@
           <w:rFonts w:ascii="Arial" w:hAnsi="Arial" w:cs="Arial"/>
           <w:b/>
           <w:bCs/>
+          <w:sz w:val="21"/>
+          <w:szCs w:val="21"/>
         </w:rPr>
         <w:t>Esami ematici</w:t>
       </w:r>
@@ -825,6 +1026,8 @@
           <w:rFonts w:ascii="Arial" w:hAnsi="Arial" w:cs="Arial"/>
           <w:b/>
           <w:bCs/>
+          <w:sz w:val="21"/>
+          <w:szCs w:val="21"/>
         </w:rPr>
         <w:t xml:space="preserve"> </w:t>
       </w:r>
@@ -833,6 +1036,8 @@
           <w:rFonts w:ascii="Arial" w:hAnsi="Arial" w:cs="Arial"/>
           <w:b/>
           <w:bCs/>
+          <w:sz w:val="21"/>
+          <w:szCs w:val="21"/>
         </w:rPr>
         <w:t>(</w:t>
       </w:r>
@@ -841,6 +1046,8 @@
           <w:rFonts w:ascii="Arial" w:hAnsi="Arial" w:cs="Arial"/>
           <w:b/>
           <w:bCs/>
+          <w:sz w:val="21"/>
+          <w:szCs w:val="21"/>
         </w:rPr>
         <w:t>{</w:t>
       </w:r>
@@ -850,6 +1057,8 @@
           <w:rFonts w:ascii="Arial" w:hAnsi="Arial" w:cs="Arial"/>
           <w:b/>
           <w:bCs/>
+          <w:sz w:val="21"/>
+          <w:szCs w:val="21"/>
         </w:rPr>
         <w:t>data_ee</w:t>
       </w:r>
@@ -859,6 +1068,8 @@
           <w:rFonts w:ascii="Arial" w:hAnsi="Arial" w:cs="Arial"/>
           <w:b/>
           <w:bCs/>
+          <w:sz w:val="21"/>
+          <w:szCs w:val="21"/>
         </w:rPr>
         <w:t>}</w:t>
       </w:r>
@@ -867,6 +1078,8 @@
           <w:rFonts w:ascii="Arial" w:hAnsi="Arial" w:cs="Arial"/>
           <w:b/>
           <w:bCs/>
+          <w:sz w:val="21"/>
+          <w:szCs w:val="21"/>
         </w:rPr>
         <w:t>)</w:t>
       </w:r>
@@ -876,11 +1089,15 @@
         <w:spacing w:line="276" w:lineRule="auto"/>
         <w:rPr>
           <w:rFonts w:ascii="Arial" w:hAnsi="Arial" w:cs="Arial"/>
-        </w:rPr>
-      </w:pPr>
-      <w:r>
-        <w:rPr>
-          <w:rFonts w:ascii="Arial" w:hAnsi="Arial" w:cs="Arial"/>
+          <w:sz w:val="21"/>
+          <w:szCs w:val="21"/>
+        </w:rPr>
+      </w:pPr>
+      <w:r>
+        <w:rPr>
+          <w:rFonts w:ascii="Arial" w:hAnsi="Arial" w:cs="Arial"/>
+          <w:sz w:val="21"/>
+          <w:szCs w:val="21"/>
         </w:rPr>
         <w:t>{</w:t>
       </w:r>
@@ -888,6 +1105,8 @@
       <w:r>
         <w:rPr>
           <w:rFonts w:ascii="Arial" w:hAnsi="Arial" w:cs="Arial"/>
+          <w:sz w:val="21"/>
+          <w:szCs w:val="21"/>
         </w:rPr>
         <w:t>ee</w:t>
       </w:r>
@@ -895,6 +1114,8 @@
       <w:r>
         <w:rPr>
           <w:rFonts w:ascii="Arial" w:hAnsi="Arial" w:cs="Arial"/>
+          <w:sz w:val="21"/>
+          <w:szCs w:val="21"/>
         </w:rPr>
         <w:t>}</w:t>
       </w:r>
@@ -904,6 +1125,8 @@
         <w:spacing w:line="276" w:lineRule="auto"/>
         <w:rPr>
           <w:rFonts w:ascii="Arial" w:hAnsi="Arial" w:cs="Arial"/>
+          <w:sz w:val="21"/>
+          <w:szCs w:val="21"/>
         </w:rPr>
       </w:pPr>
     </w:p>
@@ -914,6 +1137,8 @@
           <w:rFonts w:ascii="Arial" w:hAnsi="Arial" w:cs="Arial"/>
           <w:b/>
           <w:bCs/>
+          <w:sz w:val="21"/>
+          <w:szCs w:val="21"/>
         </w:rPr>
       </w:pPr>
       <w:r>
@@ -921,6 +1146,8 @@
           <w:rFonts w:ascii="Arial" w:hAnsi="Arial" w:cs="Arial"/>
           <w:b/>
           <w:bCs/>
+          <w:sz w:val="21"/>
+          <w:szCs w:val="21"/>
         </w:rPr>
         <w:t>Valutazione del rischio cardiovascolare</w:t>
       </w:r>
@@ -930,17 +1157,23 @@
         <w:spacing w:line="276" w:lineRule="auto"/>
         <w:rPr>
           <w:rFonts w:ascii="Arial" w:hAnsi="Arial" w:cs="Arial"/>
-        </w:rPr>
-      </w:pPr>
-      <w:r>
-        <w:rPr>
-          <w:rFonts w:ascii="Arial" w:hAnsi="Arial" w:cs="Arial"/>
+          <w:sz w:val="21"/>
+          <w:szCs w:val="21"/>
+        </w:rPr>
+      </w:pPr>
+      <w:r>
+        <w:rPr>
+          <w:rFonts w:ascii="Arial" w:hAnsi="Arial" w:cs="Arial"/>
+          <w:sz w:val="21"/>
+          <w:szCs w:val="21"/>
         </w:rPr>
         <w:t xml:space="preserve">Rischio CV: </w:t>
       </w:r>
       <w:r>
         <w:rPr>
           <w:rFonts w:ascii="Arial" w:hAnsi="Arial" w:cs="Arial"/>
+          <w:sz w:val="21"/>
+          <w:szCs w:val="21"/>
         </w:rPr>
         <w:t>{</w:t>
       </w:r>
@@ -948,6 +1181,8 @@
       <w:r>
         <w:rPr>
           <w:rFonts w:ascii="Arial" w:hAnsi="Arial" w:cs="Arial"/>
+          <w:sz w:val="21"/>
+          <w:szCs w:val="21"/>
         </w:rPr>
         <w:t>rcv</w:t>
       </w:r>
@@ -955,12 +1190,16 @@
       <w:r>
         <w:rPr>
           <w:rFonts w:ascii="Arial" w:hAnsi="Arial" w:cs="Arial"/>
+          <w:sz w:val="21"/>
+          <w:szCs w:val="21"/>
         </w:rPr>
         <w:t>}</w:t>
       </w:r>
       <w:r>
         <w:rPr>
           <w:rFonts w:ascii="Arial" w:hAnsi="Arial" w:cs="Arial"/>
+          <w:sz w:val="21"/>
+          <w:szCs w:val="21"/>
         </w:rPr>
         <w:tab/>
         <w:t>{target}</w:t>
@@ -971,6 +1210,8 @@
         <w:spacing w:line="276" w:lineRule="auto"/>
         <w:rPr>
           <w:rFonts w:ascii="Arial" w:hAnsi="Arial" w:cs="Arial"/>
+          <w:sz w:val="21"/>
+          <w:szCs w:val="21"/>
         </w:rPr>
       </w:pPr>
     </w:p>
@@ -982,6 +1223,8 @@
           <w:rFonts w:ascii="Arial" w:hAnsi="Arial" w:cs="Arial"/>
           <w:b/>
           <w:bCs/>
+          <w:sz w:val="21"/>
+          <w:szCs w:val="21"/>
         </w:rPr>
       </w:pPr>
       <w:r>
@@ -989,6 +1232,8 @@
           <w:rFonts w:ascii="Arial" w:hAnsi="Arial" w:cs="Arial"/>
           <w:b/>
           <w:bCs/>
+          <w:sz w:val="21"/>
+          <w:szCs w:val="21"/>
         </w:rPr>
         <w:t>Conclusioni</w:t>
       </w:r>
@@ -998,23 +1243,31 @@
         <w:spacing w:line="276" w:lineRule="auto"/>
         <w:rPr>
           <w:rFonts w:ascii="Arial" w:hAnsi="Arial" w:cs="Arial"/>
-        </w:rPr>
-      </w:pPr>
-      <w:r>
-        <w:rPr>
-          <w:rFonts w:ascii="Arial" w:hAnsi="Arial" w:cs="Arial"/>
+          <w:sz w:val="21"/>
+          <w:szCs w:val="21"/>
+        </w:rPr>
+      </w:pPr>
+      <w:r>
+        <w:rPr>
+          <w:rFonts w:ascii="Arial" w:hAnsi="Arial" w:cs="Arial"/>
+          <w:sz w:val="21"/>
+          <w:szCs w:val="21"/>
         </w:rPr>
         <w:t>{</w:t>
       </w:r>
       <w:r>
         <w:rPr>
           <w:rFonts w:ascii="Arial" w:hAnsi="Arial" w:cs="Arial"/>
+          <w:sz w:val="21"/>
+          <w:szCs w:val="21"/>
         </w:rPr>
         <w:t>conclusioni</w:t>
       </w:r>
       <w:r>
         <w:rPr>
           <w:rFonts w:ascii="Arial" w:hAnsi="Arial" w:cs="Arial"/>
+          <w:sz w:val="21"/>
+          <w:szCs w:val="21"/>
         </w:rPr>
         <w:t>}</w:t>
       </w:r>
@@ -1024,6 +1277,8 @@
         <w:spacing w:line="276" w:lineRule="auto"/>
         <w:rPr>
           <w:rFonts w:ascii="Arial" w:hAnsi="Arial" w:cs="Arial"/>
+          <w:sz w:val="21"/>
+          <w:szCs w:val="21"/>
         </w:rPr>
       </w:pPr>
     </w:p>
@@ -1032,6 +1287,8 @@
         <w:spacing w:line="276" w:lineRule="auto"/>
         <w:rPr>
           <w:rFonts w:ascii="Arial" w:hAnsi="Arial" w:cs="Arial"/>
+          <w:sz w:val="21"/>
+          <w:szCs w:val="21"/>
         </w:rPr>
       </w:pPr>
       <w:r>
@@ -1039,12 +1296,16 @@
           <w:rFonts w:ascii="Arial" w:hAnsi="Arial" w:cs="Arial"/>
           <w:b/>
           <w:bCs/>
+          <w:sz w:val="21"/>
+          <w:szCs w:val="21"/>
         </w:rPr>
         <w:t>Prossima visita</w:t>
       </w:r>
       <w:r>
         <w:rPr>
           <w:rFonts w:ascii="Arial" w:hAnsi="Arial" w:cs="Arial"/>
+          <w:sz w:val="21"/>
+          <w:szCs w:val="21"/>
         </w:rPr>
         <w:t>: {</w:t>
       </w:r>
@@ -1052,6 +1313,8 @@
       <w:r>
         <w:rPr>
           <w:rFonts w:ascii="Arial" w:hAnsi="Arial" w:cs="Arial"/>
+          <w:sz w:val="21"/>
+          <w:szCs w:val="21"/>
         </w:rPr>
         <w:t>proxvisita</w:t>
       </w:r>
@@ -1059,6 +1322,8 @@
       <w:r>
         <w:rPr>
           <w:rFonts w:ascii="Arial" w:hAnsi="Arial" w:cs="Arial"/>
+          <w:sz w:val="21"/>
+          <w:szCs w:val="21"/>
         </w:rPr>
         <w:t>}</w:t>
       </w:r>
@@ -1068,6 +1333,8 @@
         <w:spacing w:line="276" w:lineRule="auto"/>
         <w:rPr>
           <w:rFonts w:ascii="Arial" w:hAnsi="Arial" w:cs="Arial"/>
+          <w:sz w:val="21"/>
+          <w:szCs w:val="21"/>
         </w:rPr>
       </w:pPr>
       <w:r>
@@ -1075,12 +1342,16 @@
           <w:rFonts w:ascii="Arial" w:hAnsi="Arial" w:cs="Arial"/>
           <w:b/>
           <w:bCs/>
+          <w:sz w:val="21"/>
+          <w:szCs w:val="21"/>
         </w:rPr>
         <w:t>Esami da eseguire</w:t>
       </w:r>
       <w:r>
         <w:rPr>
           <w:rFonts w:ascii="Arial" w:hAnsi="Arial" w:cs="Arial"/>
+          <w:sz w:val="21"/>
+          <w:szCs w:val="21"/>
         </w:rPr>
         <w:t>: {</w:t>
       </w:r>
@@ -1088,6 +1359,8 @@
       <w:r>
         <w:rPr>
           <w:rFonts w:ascii="Arial" w:hAnsi="Arial" w:cs="Arial"/>
+          <w:sz w:val="21"/>
+          <w:szCs w:val="21"/>
         </w:rPr>
         <w:t>proxee</w:t>
       </w:r>
@@ -1095,6 +1368,8 @@
       <w:r>
         <w:rPr>
           <w:rFonts w:ascii="Arial" w:hAnsi="Arial" w:cs="Arial"/>
+          <w:sz w:val="21"/>
+          <w:szCs w:val="21"/>
         </w:rPr>
         <w:t>}</w:t>
       </w:r>
@@ -1104,6 +1379,8 @@
         <w:spacing w:line="276" w:lineRule="auto"/>
         <w:rPr>
           <w:rFonts w:ascii="Arial" w:hAnsi="Arial" w:cs="Arial"/>
+          <w:sz w:val="21"/>
+          <w:szCs w:val="21"/>
         </w:rPr>
       </w:pPr>
     </w:p>
@@ -1115,6 +1392,8 @@
           <w:rFonts w:ascii="Arial" w:hAnsi="Arial" w:cs="Arial"/>
           <w:b/>
           <w:bCs/>
+          <w:sz w:val="21"/>
+          <w:szCs w:val="21"/>
         </w:rPr>
       </w:pPr>
       <w:r>
@@ -1122,6 +1401,8 @@
           <w:rFonts w:ascii="Arial" w:hAnsi="Arial" w:cs="Arial"/>
           <w:b/>
           <w:bCs/>
+          <w:sz w:val="21"/>
+          <w:szCs w:val="21"/>
         </w:rPr>
         <w:t>Il medico cardiologo</w:t>
       </w:r>
@@ -1131,11 +1412,15 @@
         <w:spacing w:line="276" w:lineRule="auto"/>
         <w:rPr>
           <w:rFonts w:ascii="Arial" w:hAnsi="Arial" w:cs="Arial"/>
-        </w:rPr>
-      </w:pPr>
-      <w:r>
-        <w:rPr>
-          <w:rFonts w:ascii="Arial" w:hAnsi="Arial" w:cs="Arial"/>
+          <w:sz w:val="21"/>
+          <w:szCs w:val="21"/>
+        </w:rPr>
+      </w:pPr>
+      <w:r>
+        <w:rPr>
+          <w:rFonts w:ascii="Arial" w:hAnsi="Arial" w:cs="Arial"/>
+          <w:sz w:val="21"/>
+          <w:szCs w:val="21"/>
         </w:rPr>
         <w:t>{</w:t>
       </w:r>
@@ -1143,6 +1428,8 @@
       <w:r>
         <w:rPr>
           <w:rFonts w:ascii="Arial" w:hAnsi="Arial" w:cs="Arial"/>
+          <w:sz w:val="21"/>
+          <w:szCs w:val="21"/>
         </w:rPr>
         <w:t>dottssa</w:t>
       </w:r>
@@ -1150,30 +1437,40 @@
       <w:r>
         <w:rPr>
           <w:rFonts w:ascii="Arial" w:hAnsi="Arial" w:cs="Arial"/>
+          <w:sz w:val="21"/>
+          <w:szCs w:val="21"/>
         </w:rPr>
         <w:t>}</w:t>
       </w:r>
       <w:r>
         <w:rPr>
           <w:rFonts w:ascii="Arial" w:hAnsi="Arial" w:cs="Arial"/>
+          <w:sz w:val="21"/>
+          <w:szCs w:val="21"/>
         </w:rPr>
         <w:t xml:space="preserve"> </w:t>
       </w:r>
       <w:r>
         <w:rPr>
           <w:rFonts w:ascii="Arial" w:hAnsi="Arial" w:cs="Arial"/>
+          <w:sz w:val="21"/>
+          <w:szCs w:val="21"/>
         </w:rPr>
         <w:t>{</w:t>
       </w:r>
       <w:r>
         <w:rPr>
           <w:rFonts w:ascii="Arial" w:hAnsi="Arial" w:cs="Arial"/>
+          <w:sz w:val="21"/>
+          <w:szCs w:val="21"/>
         </w:rPr>
         <w:t>cardiologo</w:t>
       </w:r>
       <w:r>
         <w:rPr>
           <w:rFonts w:ascii="Arial" w:hAnsi="Arial" w:cs="Arial"/>
+          <w:sz w:val="21"/>
+          <w:szCs w:val="21"/>
         </w:rPr>
         <w:t>}</w:t>
       </w:r>
@@ -1183,6 +1480,8 @@
         <w:spacing w:line="276" w:lineRule="auto"/>
         <w:rPr>
           <w:rFonts w:ascii="Arial" w:hAnsi="Arial" w:cs="Arial"/>
+          <w:sz w:val="21"/>
+          <w:szCs w:val="21"/>
         </w:rPr>
       </w:pPr>
     </w:p>
@@ -1194,6 +1493,8 @@
           <w:rFonts w:ascii="Arial" w:hAnsi="Arial" w:cs="Arial"/>
           <w:b/>
           <w:bCs/>
+          <w:sz w:val="21"/>
+          <w:szCs w:val="21"/>
         </w:rPr>
       </w:pPr>
       <w:r>
@@ -1201,6 +1502,8 @@
           <w:rFonts w:ascii="Arial" w:hAnsi="Arial" w:cs="Arial"/>
           <w:b/>
           <w:bCs/>
+          <w:sz w:val="21"/>
+          <w:szCs w:val="21"/>
         </w:rPr>
         <w:t>I medici specializzandi</w:t>
       </w:r>
@@ -1210,29 +1513,39 @@
         <w:spacing w:line="276" w:lineRule="auto"/>
         <w:rPr>
           <w:rFonts w:ascii="Arial" w:hAnsi="Arial" w:cs="Arial"/>
-        </w:rPr>
-      </w:pPr>
-      <w:r>
-        <w:rPr>
-          <w:rFonts w:ascii="Arial" w:hAnsi="Arial" w:cs="Arial"/>
+          <w:sz w:val="21"/>
+          <w:szCs w:val="21"/>
+        </w:rPr>
+      </w:pPr>
+      <w:r>
+        <w:rPr>
+          <w:rFonts w:ascii="Arial" w:hAnsi="Arial" w:cs="Arial"/>
+          <w:sz w:val="21"/>
+          <w:szCs w:val="21"/>
         </w:rPr>
         <w:t xml:space="preserve">{dottssasp1} </w:t>
       </w:r>
       <w:r>
         <w:rPr>
           <w:rFonts w:ascii="Arial" w:hAnsi="Arial" w:cs="Arial"/>
+          <w:sz w:val="21"/>
+          <w:szCs w:val="21"/>
         </w:rPr>
         <w:t>{</w:t>
       </w:r>
       <w:r>
         <w:rPr>
           <w:rFonts w:ascii="Arial" w:hAnsi="Arial" w:cs="Arial"/>
+          <w:sz w:val="21"/>
+          <w:szCs w:val="21"/>
         </w:rPr>
         <w:t>specializzando1</w:t>
       </w:r>
       <w:r>
         <w:rPr>
           <w:rFonts w:ascii="Arial" w:hAnsi="Arial" w:cs="Arial"/>
+          <w:sz w:val="21"/>
+          <w:szCs w:val="21"/>
         </w:rPr>
         <w:t>}</w:t>
       </w:r>
@@ -1242,11 +1555,15 @@
         <w:spacing w:line="276" w:lineRule="auto"/>
         <w:rPr>
           <w:rFonts w:ascii="Arial" w:hAnsi="Arial" w:cs="Arial"/>
-        </w:rPr>
-      </w:pPr>
-      <w:r>
-        <w:rPr>
-          <w:rFonts w:ascii="Arial" w:hAnsi="Arial" w:cs="Arial"/>
+          <w:sz w:val="21"/>
+          <w:szCs w:val="21"/>
+        </w:rPr>
+      </w:pPr>
+      <w:r>
+        <w:rPr>
+          <w:rFonts w:ascii="Arial" w:hAnsi="Arial" w:cs="Arial"/>
+          <w:sz w:val="21"/>
+          <w:szCs w:val="21"/>
         </w:rPr>
         <w:t>{dottssasp2} {specializzando2}</w:t>
       </w:r>
@@ -1256,13 +1573,16 @@
         <w:spacing w:line="276" w:lineRule="auto"/>
         <w:rPr>
           <w:rFonts w:ascii="Arial" w:hAnsi="Arial" w:cs="Arial"/>
-        </w:rPr>
-      </w:pPr>
-      <w:r>
-        <w:rPr>
-          <w:rFonts w:ascii="Arial" w:hAnsi="Arial" w:cs="Arial"/>
-        </w:rPr>
-        <w:lastRenderedPageBreak/>
+          <w:sz w:val="21"/>
+          <w:szCs w:val="21"/>
+        </w:rPr>
+      </w:pPr>
+      <w:r>
+        <w:rPr>
+          <w:rFonts w:ascii="Arial" w:hAnsi="Arial" w:cs="Arial"/>
+          <w:sz w:val="21"/>
+          <w:szCs w:val="21"/>
+        </w:rPr>
         <w:t>{dottssasp3} {specializzando3}</w:t>
       </w:r>
     </w:p>
@@ -1307,628 +1627,18 @@
       <w:rPr>
         <w:noProof/>
       </w:rPr>
-      <w:drawing>
-        <wp:anchor distT="0" distB="0" distL="114300" distR="114300" simplePos="0" relativeHeight="251673600" behindDoc="0" locked="0" layoutInCell="1" allowOverlap="1" wp14:anchorId="7DC32C0C" wp14:editId="055B271D">
-          <wp:simplePos x="0" y="0"/>
-          <wp:positionH relativeFrom="column">
-            <wp:posOffset>5820892</wp:posOffset>
-          </wp:positionH>
-          <wp:positionV relativeFrom="paragraph">
-            <wp:posOffset>445464</wp:posOffset>
-          </wp:positionV>
-          <wp:extent cx="324000" cy="324000"/>
-          <wp:effectExtent l="0" t="0" r="6350" b="6350"/>
-          <wp:wrapNone/>
-          <wp:docPr id="650469873" name="Immagine 1"/>
-          <wp:cNvGraphicFramePr>
-            <a:graphicFrameLocks xmlns:a="http://schemas.openxmlformats.org/drawingml/2006/main" noChangeAspect="1"/>
-          </wp:cNvGraphicFramePr>
-          <a:graphic xmlns:a="http://schemas.openxmlformats.org/drawingml/2006/main">
-            <a:graphicData uri="http://schemas.openxmlformats.org/drawingml/2006/picture">
-              <pic:pic xmlns:pic="http://schemas.openxmlformats.org/drawingml/2006/picture">
-                <pic:nvPicPr>
-                  <pic:cNvPr id="650469873" name=""/>
-                  <pic:cNvPicPr/>
-                </pic:nvPicPr>
-                <pic:blipFill>
-                  <a:blip r:embed="rId1">
-                    <a:extLst>
-                      <a:ext uri="{28A0092B-C50C-407E-A947-70E740481C1C}">
-                        <a14:useLocalDpi xmlns:a14="http://schemas.microsoft.com/office/drawing/2010/main" val="0"/>
-                      </a:ext>
-                    </a:extLst>
-                  </a:blip>
-                  <a:stretch>
-                    <a:fillRect/>
-                  </a:stretch>
-                </pic:blipFill>
-                <pic:spPr>
-                  <a:xfrm>
-                    <a:off x="0" y="0"/>
-                    <a:ext cx="324000" cy="324000"/>
-                  </a:xfrm>
-                  <a:prstGeom prst="rect">
-                    <a:avLst/>
-                  </a:prstGeom>
-                </pic:spPr>
-              </pic:pic>
-            </a:graphicData>
-          </a:graphic>
-          <wp14:sizeRelH relativeFrom="page">
-            <wp14:pctWidth>0</wp14:pctWidth>
-          </wp14:sizeRelH>
-          <wp14:sizeRelV relativeFrom="page">
-            <wp14:pctHeight>0</wp14:pctHeight>
-          </wp14:sizeRelV>
-        </wp:anchor>
-      </w:drawing>
-    </w:r>
-    <w:r>
-      <w:rPr>
-        <w:noProof/>
-      </w:rPr>
       <mc:AlternateContent>
         <mc:Choice Requires="wps">
           <w:drawing>
-            <wp:anchor distT="0" distB="0" distL="114935" distR="114935" simplePos="0" relativeHeight="251657215" behindDoc="1" locked="0" layoutInCell="1" allowOverlap="1" wp14:anchorId="3C88F6DD" wp14:editId="0F887179">
+            <wp:anchor distT="0" distB="0" distL="114935" distR="114935" simplePos="0" relativeHeight="251675648" behindDoc="1" locked="0" layoutInCell="1" allowOverlap="1" wp14:anchorId="7AF811E9" wp14:editId="152095DF">
               <wp:simplePos x="0" y="0"/>
               <wp:positionH relativeFrom="page">
-                <wp:posOffset>5524102</wp:posOffset>
+                <wp:posOffset>1072515</wp:posOffset>
               </wp:positionH>
               <wp:positionV relativeFrom="page">
-                <wp:posOffset>9677400</wp:posOffset>
+                <wp:posOffset>9686290</wp:posOffset>
               </wp:positionV>
-              <wp:extent cx="1258570" cy="767715"/>
-              <wp:effectExtent l="0" t="0" r="0" b="0"/>
-              <wp:wrapNone/>
-              <wp:docPr id="251092099" name="Text Box 1"/>
-              <wp:cNvGraphicFramePr>
-                <a:graphicFrameLocks xmlns:a="http://schemas.openxmlformats.org/drawingml/2006/main"/>
-              </wp:cNvGraphicFramePr>
-              <a:graphic xmlns:a="http://schemas.openxmlformats.org/drawingml/2006/main">
-                <a:graphicData uri="http://schemas.microsoft.com/office/word/2010/wordprocessingShape">
-                  <wps:wsp>
-                    <wps:cNvSpPr txBox="1">
-                      <a:spLocks/>
-                    </wps:cNvSpPr>
-                    <wps:spPr bwMode="auto">
-                      <a:xfrm>
-                        <a:off x="0" y="0"/>
-                        <a:ext cx="1258570" cy="767715"/>
-                      </a:xfrm>
-                      <a:prstGeom prst="rect">
-                        <a:avLst/>
-                      </a:prstGeom>
-                      <a:solidFill>
-                        <a:srgbClr val="FFFFFF">
-                          <a:alpha val="0"/>
-                        </a:srgbClr>
-                      </a:solidFill>
-                      <a:ln>
-                        <a:noFill/>
-                      </a:ln>
-                      <a:extLst>
-                        <a:ext uri="{91240B29-F687-4F45-9708-019B960494DF}">
-                          <a14:hiddenLine xmlns:a14="http://schemas.microsoft.com/office/drawing/2010/main" w="9525">
-                            <a:solidFill>
-                              <a:srgbClr val="000000"/>
-                            </a:solidFill>
-                            <a:miter lim="800000"/>
-                            <a:headEnd/>
-                            <a:tailEnd/>
-                          </a14:hiddenLine>
-                        </a:ext>
-                      </a:extLst>
-                    </wps:spPr>
-                    <wps:txbx>
-                      <w:txbxContent>
-                        <w:p>
-                          <w:pPr>
-                            <w:rPr>
-                              <w:iCs/>
-                            </w:rPr>
-                          </w:pPr>
-                          <w:r>
-                            <w:rPr>
-                              <w:rFonts w:ascii="Arial" w:eastAsia="Times New Roman" w:hAnsi="Arial" w:cs="Arial"/>
-                              <w:b/>
-                              <w:bCs/>
-                              <w:iCs/>
-                              <w:color w:val="C00000"/>
-                              <w:sz w:val="16"/>
-                              <w:szCs w:val="16"/>
-                            </w:rPr>
-                            <w:t>U.O.C. Cardiologia</w:t>
-                          </w:r>
-                          <w:r>
-                            <w:rPr>
-                              <w:rFonts w:ascii="Arial" w:eastAsia="Times New Roman" w:hAnsi="Arial" w:cs="Arial"/>
-                              <w:b/>
-                              <w:bCs/>
-                              <w:iCs/>
-                              <w:color w:val="C00000"/>
-                              <w:sz w:val="16"/>
-                              <w:szCs w:val="16"/>
-                            </w:rPr>
-                            <w:t xml:space="preserve"> Clinica</w:t>
-                          </w:r>
-                          <w:r>
-                            <w:rPr>
-                              <w:rFonts w:ascii="Arial" w:eastAsia="Times New Roman" w:hAnsi="Arial" w:cs="Arial"/>
-                              <w:b/>
-                              <w:bCs/>
-                              <w:iCs/>
-                              <w:color w:val="C00000"/>
-                              <w:sz w:val="16"/>
-                              <w:szCs w:val="16"/>
-                            </w:rPr>
-                            <w:t xml:space="preserve"> e Interventistica</w:t>
-                          </w:r>
-                        </w:p>
-                        <w:p>
-                          <w:pPr>
-                            <w:rPr>
-                              <w:iCs/>
-                            </w:rPr>
-                          </w:pPr>
-                          <w:r>
-                            <w:rPr>
-                              <w:rFonts w:ascii="Arial" w:eastAsia="Times New Roman" w:hAnsi="Arial" w:cs="Arial"/>
-                              <w:iCs/>
-                              <w:color w:val="C00000"/>
-                              <w:sz w:val="16"/>
-                              <w:szCs w:val="16"/>
-                            </w:rPr>
-                            <w:t>Via E. De Nicola n. 14</w:t>
-                          </w:r>
-                        </w:p>
-                        <w:p>
-                          <w:pPr>
-                            <w:rPr>
-                              <w:rFonts w:ascii="Arial" w:eastAsia="Times New Roman" w:hAnsi="Arial" w:cs="Arial"/>
-                              <w:bCs/>
-                              <w:i/>
-                              <w:color w:val="C00000"/>
-                              <w:sz w:val="16"/>
-                              <w:szCs w:val="16"/>
-                            </w:rPr>
-                          </w:pPr>
-                          <w:r>
-                            <w:rPr>
-                              <w:rFonts w:ascii="Arial" w:eastAsia="Times New Roman" w:hAnsi="Arial" w:cs="Arial"/>
-                              <w:bCs/>
-                              <w:i/>
-                              <w:color w:val="C00000"/>
-                              <w:sz w:val="16"/>
-                              <w:szCs w:val="16"/>
-                            </w:rPr>
-                            <w:t>07100 Sassari</w:t>
-                          </w:r>
-                        </w:p>
-                        <w:p>
-                          <w:r>
-                            <w:rPr>
-                              <w:rFonts w:ascii="Arial" w:eastAsia="Times New Roman" w:hAnsi="Arial" w:cs="Arial"/>
-                              <w:bCs/>
-                              <w:i/>
-                              <w:color w:val="C00000"/>
-                              <w:sz w:val="16"/>
-                              <w:szCs w:val="16"/>
-                            </w:rPr>
-                            <w:t>Tel. 0792061540</w:t>
-                          </w:r>
-                        </w:p>
-                        <w:p>
-                          <w:r>
-                            <w:rPr>
-                              <w:rFonts w:ascii="Arial" w:eastAsia="Times New Roman" w:hAnsi="Arial" w:cs="Arial"/>
-                              <w:bCs/>
-                              <w:i/>
-                              <w:color w:val="C00000"/>
-                              <w:sz w:val="16"/>
-                              <w:szCs w:val="16"/>
-                            </w:rPr>
-                            <w:t>Fax 079210512</w:t>
-                          </w:r>
-                        </w:p>
-                        <w:p>
-                          <w:r>
-                            <w:rPr>
-                              <w:rFonts w:ascii="Arial" w:eastAsia="Arial" w:hAnsi="Arial" w:cs="Arial"/>
-                              <w:bCs/>
-                              <w:color w:val="C00000"/>
-                              <w:sz w:val="16"/>
-                              <w:szCs w:val="16"/>
-                            </w:rPr>
-                            <w:t xml:space="preserve">               </w:t>
-                          </w:r>
-                        </w:p>
-                        <w:p>
-                          <w:pPr>
-                            <w:autoSpaceDE w:val="0"/>
-                            <w:rPr>
-                              <w:rFonts w:ascii="Arial" w:eastAsia="Times New Roman" w:hAnsi="Arial" w:cs="Arial"/>
-                              <w:bCs/>
-                              <w:i/>
-                              <w:color w:val="00B0F0"/>
-                              <w:sz w:val="16"/>
-                              <w:szCs w:val="16"/>
-                            </w:rPr>
-                          </w:pPr>
-                        </w:p>
-                      </w:txbxContent>
-                    </wps:txbx>
-                    <wps:bodyPr rot="0" vert="horz" wrap="square" lIns="1270" tIns="1270" rIns="92710" bIns="46990" anchor="t" anchorCtr="0" upright="1">
-                      <a:noAutofit/>
-                    </wps:bodyPr>
-                  </wps:wsp>
-                </a:graphicData>
-              </a:graphic>
-              <wp14:sizeRelH relativeFrom="page">
-                <wp14:pctWidth>0</wp14:pctWidth>
-              </wp14:sizeRelH>
-              <wp14:sizeRelV relativeFrom="page">
-                <wp14:pctHeight>0</wp14:pctHeight>
-              </wp14:sizeRelV>
-            </wp:anchor>
-          </w:drawing>
-        </mc:Choice>
-        <mc:Fallback>
-          <w:pict>
-            <v:shapetype w14:anchorId="3C88F6DD" id="_x0000_t202" coordsize="21600,21600" o:spt="202" path="m,l,21600r21600,l21600,xe">
-              <v:stroke joinstyle="miter"/>
-              <v:path gradientshapeok="t" o:connecttype="rect"/>
-            </v:shapetype>
-            <v:shape id="Text Box 1" o:spid="_x0000_s1027" type="#_x0000_t202" style="position:absolute;margin-left:434.95pt;margin-top:762pt;width:99.1pt;height:60.45pt;z-index:-251659265;visibility:visible;mso-wrap-style:square;mso-width-percent:0;mso-height-percent:0;mso-wrap-distance-left:9.05pt;mso-wrap-distance-top:0;mso-wrap-distance-right:9.05pt;mso-wrap-distance-bottom:0;mso-position-horizontal:absolute;mso-position-horizontal-relative:page;mso-position-vertical:absolute;mso-position-vertical-relative:page;mso-width-percent:0;mso-height-percent:0;mso-width-relative:page;mso-height-relative:page;v-text-anchor:top" o:gfxdata="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" stroked="f">
-              <v:fill opacity="0"/>
-              <v:path arrowok="t"/>
-              <v:textbox inset=".1pt,.1pt,7.3pt,3.7pt">
-                <w:txbxContent>
-                  <w:p>
-                    <w:pPr>
-                      <w:rPr>
-                        <w:iCs/>
-                      </w:rPr>
-                    </w:pPr>
-                    <w:r>
-                      <w:rPr>
-                        <w:rFonts w:ascii="Arial" w:eastAsia="Times New Roman" w:hAnsi="Arial" w:cs="Arial"/>
-                        <w:b/>
-                        <w:bCs/>
-                        <w:iCs/>
-                        <w:color w:val="C00000"/>
-                        <w:sz w:val="16"/>
-                        <w:szCs w:val="16"/>
-                      </w:rPr>
-                      <w:t>U.O.C. Cardiologia</w:t>
-                    </w:r>
-                    <w:r>
-                      <w:rPr>
-                        <w:rFonts w:ascii="Arial" w:eastAsia="Times New Roman" w:hAnsi="Arial" w:cs="Arial"/>
-                        <w:b/>
-                        <w:bCs/>
-                        <w:iCs/>
-                        <w:color w:val="C00000"/>
-                        <w:sz w:val="16"/>
-                        <w:szCs w:val="16"/>
-                      </w:rPr>
-                      <w:t xml:space="preserve"> Clinica</w:t>
-                    </w:r>
-                    <w:r>
-                      <w:rPr>
-                        <w:rFonts w:ascii="Arial" w:eastAsia="Times New Roman" w:hAnsi="Arial" w:cs="Arial"/>
-                        <w:b/>
-                        <w:bCs/>
-                        <w:iCs/>
-                        <w:color w:val="C00000"/>
-                        <w:sz w:val="16"/>
-                        <w:szCs w:val="16"/>
-                      </w:rPr>
-                      <w:t xml:space="preserve"> e Interventistica</w:t>
-                    </w:r>
-                  </w:p>
-                  <w:p>
-                    <w:pPr>
-                      <w:rPr>
-                        <w:iCs/>
-                      </w:rPr>
-                    </w:pPr>
-                    <w:r>
-                      <w:rPr>
-                        <w:rFonts w:ascii="Arial" w:eastAsia="Times New Roman" w:hAnsi="Arial" w:cs="Arial"/>
-                        <w:iCs/>
-                        <w:color w:val="C00000"/>
-                        <w:sz w:val="16"/>
-                        <w:szCs w:val="16"/>
-                      </w:rPr>
-                      <w:t>Via E. De Nicola n. 14</w:t>
-                    </w:r>
-                  </w:p>
-                  <w:p>
-                    <w:pPr>
-                      <w:rPr>
-                        <w:rFonts w:ascii="Arial" w:eastAsia="Times New Roman" w:hAnsi="Arial" w:cs="Arial"/>
-                        <w:bCs/>
-                        <w:i/>
-                        <w:color w:val="C00000"/>
-                        <w:sz w:val="16"/>
-                        <w:szCs w:val="16"/>
-                      </w:rPr>
-                    </w:pPr>
-                    <w:r>
-                      <w:rPr>
-                        <w:rFonts w:ascii="Arial" w:eastAsia="Times New Roman" w:hAnsi="Arial" w:cs="Arial"/>
-                        <w:bCs/>
-                        <w:i/>
-                        <w:color w:val="C00000"/>
-                        <w:sz w:val="16"/>
-                        <w:szCs w:val="16"/>
-                      </w:rPr>
-                      <w:t>07100 Sassari</w:t>
-                    </w:r>
-                  </w:p>
-                  <w:p>
-                    <w:r>
-                      <w:rPr>
-                        <w:rFonts w:ascii="Arial" w:eastAsia="Times New Roman" w:hAnsi="Arial" w:cs="Arial"/>
-                        <w:bCs/>
-                        <w:i/>
-                        <w:color w:val="C00000"/>
-                        <w:sz w:val="16"/>
-                        <w:szCs w:val="16"/>
-                      </w:rPr>
-                      <w:t>Tel. 0792061540</w:t>
-                    </w:r>
-                  </w:p>
-                  <w:p>
-                    <w:r>
-                      <w:rPr>
-                        <w:rFonts w:ascii="Arial" w:eastAsia="Times New Roman" w:hAnsi="Arial" w:cs="Arial"/>
-                        <w:bCs/>
-                        <w:i/>
-                        <w:color w:val="C00000"/>
-                        <w:sz w:val="16"/>
-                        <w:szCs w:val="16"/>
-                      </w:rPr>
-                      <w:t>Fax 079210512</w:t>
-                    </w:r>
-                  </w:p>
-                  <w:p>
-                    <w:r>
-                      <w:rPr>
-                        <w:rFonts w:ascii="Arial" w:eastAsia="Arial" w:hAnsi="Arial" w:cs="Arial"/>
-                        <w:bCs/>
-                        <w:color w:val="C00000"/>
-                        <w:sz w:val="16"/>
-                        <w:szCs w:val="16"/>
-                      </w:rPr>
-                      <w:t xml:space="preserve">               </w:t>
-                    </w:r>
-                  </w:p>
-                  <w:p>
-                    <w:pPr>
-                      <w:autoSpaceDE w:val="0"/>
-                      <w:rPr>
-                        <w:rFonts w:ascii="Arial" w:eastAsia="Times New Roman" w:hAnsi="Arial" w:cs="Arial"/>
-                        <w:bCs/>
-                        <w:i/>
-                        <w:color w:val="00B0F0"/>
-                        <w:sz w:val="16"/>
-                        <w:szCs w:val="16"/>
-                      </w:rPr>
-                    </w:pPr>
-                  </w:p>
-                </w:txbxContent>
-              </v:textbox>
-              <w10:wrap anchorx="page" anchory="page"/>
-            </v:shape>
-          </w:pict>
-        </mc:Fallback>
-      </mc:AlternateContent>
-    </w:r>
-    <w:r>
-      <w:rPr>
-        <w:noProof/>
-      </w:rPr>
-      <mc:AlternateContent>
-        <mc:Choice Requires="wps">
-          <w:drawing>
-            <wp:anchor distT="0" distB="0" distL="114935" distR="114935" simplePos="0" relativeHeight="251666432" behindDoc="1" locked="0" layoutInCell="1" allowOverlap="1" wp14:anchorId="10B21FFA" wp14:editId="7D7DE870">
-              <wp:simplePos x="0" y="0"/>
-              <wp:positionH relativeFrom="page">
-                <wp:posOffset>3075905</wp:posOffset>
-              </wp:positionH>
-              <wp:positionV relativeFrom="page">
-                <wp:posOffset>9677400</wp:posOffset>
-              </wp:positionV>
-              <wp:extent cx="1522655" cy="446048"/>
-              <wp:effectExtent l="0" t="0" r="0" b="0"/>
-              <wp:wrapNone/>
-              <wp:docPr id="361227445" name="Text Box 2"/>
-              <wp:cNvGraphicFramePr>
-                <a:graphicFrameLocks xmlns:a="http://schemas.openxmlformats.org/drawingml/2006/main"/>
-              </wp:cNvGraphicFramePr>
-              <a:graphic xmlns:a="http://schemas.openxmlformats.org/drawingml/2006/main">
-                <a:graphicData uri="http://schemas.microsoft.com/office/word/2010/wordprocessingShape">
-                  <wps:wsp>
-                    <wps:cNvSpPr txBox="1">
-                      <a:spLocks/>
-                    </wps:cNvSpPr>
-                    <wps:spPr bwMode="auto">
-                      <a:xfrm>
-                        <a:off x="0" y="0"/>
-                        <a:ext cx="1522655" cy="446048"/>
-                      </a:xfrm>
-                      <a:prstGeom prst="rect">
-                        <a:avLst/>
-                      </a:prstGeom>
-                      <a:solidFill>
-                        <a:srgbClr val="FFFFFF">
-                          <a:alpha val="0"/>
-                        </a:srgbClr>
-                      </a:solidFill>
-                      <a:ln>
-                        <a:noFill/>
-                      </a:ln>
-                      <a:extLst>
-                        <a:ext uri="{91240B29-F687-4F45-9708-019B960494DF}">
-                          <a14:hiddenLine xmlns:a14="http://schemas.microsoft.com/office/drawing/2010/main" w="9525">
-                            <a:solidFill>
-                              <a:srgbClr val="000000"/>
-                            </a:solidFill>
-                            <a:miter lim="800000"/>
-                            <a:headEnd/>
-                            <a:tailEnd/>
-                          </a14:hiddenLine>
-                        </a:ext>
-                      </a:extLst>
-                    </wps:spPr>
-                    <wps:txbx>
-                      <w:txbxContent>
-                        <w:p>
-                          <w:r>
-                            <w:rPr>
-                              <w:rFonts w:ascii="Arial" w:hAnsi="Arial" w:cs="Arial"/>
-                              <w:b/>
-                              <w:bCs/>
-                              <w:color w:val="C00000"/>
-                              <w:sz w:val="16"/>
-                              <w:szCs w:val="16"/>
-                            </w:rPr>
-                            <w:t>OSPEDALE</w:t>
-                          </w:r>
-                          <w:r>
-                            <w:rPr>
-                              <w:rFonts w:ascii="Arial" w:hAnsi="Arial" w:cs="Arial"/>
-                              <w:b/>
-                              <w:bCs/>
-                              <w:color w:val="C00000"/>
-                              <w:sz w:val="16"/>
-                              <w:szCs w:val="16"/>
-                            </w:rPr>
-                            <w:t xml:space="preserve"> SS. ANNUNZIATA</w:t>
-                          </w:r>
-                        </w:p>
-                        <w:p>
-                          <w:r>
-                            <w:rPr>
-                              <w:rFonts w:ascii="Arial" w:hAnsi="Arial" w:cs="Arial"/>
-                              <w:bCs/>
-                              <w:color w:val="C00000"/>
-                              <w:sz w:val="16"/>
-                              <w:szCs w:val="16"/>
-                            </w:rPr>
-                            <w:t>Via E. De Nicola n. 14</w:t>
-                          </w:r>
-                        </w:p>
-                        <w:p>
-                          <w:r>
-                            <w:rPr>
-                              <w:rFonts w:ascii="Arial" w:hAnsi="Arial" w:cs="Arial"/>
-                              <w:bCs/>
-                              <w:color w:val="C00000"/>
-                              <w:sz w:val="16"/>
-                              <w:szCs w:val="16"/>
-                            </w:rPr>
-                            <w:t>07100 Sassari</w:t>
-                          </w:r>
-                        </w:p>
-                      </w:txbxContent>
-                    </wps:txbx>
-                    <wps:bodyPr rot="0" vert="horz" wrap="square" lIns="1270" tIns="1270" rIns="92710" bIns="46990" anchor="t" anchorCtr="0" upright="1">
-                      <a:noAutofit/>
-                    </wps:bodyPr>
-                  </wps:wsp>
-                </a:graphicData>
-              </a:graphic>
-              <wp14:sizeRelH relativeFrom="page">
-                <wp14:pctWidth>0</wp14:pctWidth>
-              </wp14:sizeRelH>
-              <wp14:sizeRelV relativeFrom="page">
-                <wp14:pctHeight>0</wp14:pctHeight>
-              </wp14:sizeRelV>
-            </wp:anchor>
-          </w:drawing>
-        </mc:Choice>
-        <mc:Fallback>
-          <w:pict>
-            <v:shape w14:anchorId="10B21FFA" id="Text Box 2" o:spid="_x0000_s1028" type="#_x0000_t202" style="position:absolute;margin-left:242.2pt;margin-top:762pt;width:119.9pt;height:35.1pt;z-index:-251650048;visibility:visible;mso-wrap-style:square;mso-width-percent:0;mso-height-percent:0;mso-wrap-distance-left:9.05pt;mso-wrap-distance-top:0;mso-wrap-distance-right:9.05pt;mso-wrap-distance-bottom:0;mso-position-horizontal:absolute;mso-position-horizontal-relative:page;mso-position-vertical:absolute;mso-position-vertical-relative:page;mso-width-percent:0;mso-height-percent:0;mso-width-relative:page;mso-height-relative:page;v-text-anchor:top" o:gfxdata="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" stroked="f">
-              <v:fill opacity="0"/>
-              <v:path arrowok="t"/>
-              <v:textbox inset=".1pt,.1pt,7.3pt,3.7pt">
-                <w:txbxContent>
-                  <w:p>
-                    <w:r>
-                      <w:rPr>
-                        <w:rFonts w:ascii="Arial" w:hAnsi="Arial" w:cs="Arial"/>
-                        <w:b/>
-                        <w:bCs/>
-                        <w:color w:val="C00000"/>
-                        <w:sz w:val="16"/>
-                        <w:szCs w:val="16"/>
-                      </w:rPr>
-                      <w:t>OSPEDALE</w:t>
-                    </w:r>
-                    <w:r>
-                      <w:rPr>
-                        <w:rFonts w:ascii="Arial" w:hAnsi="Arial" w:cs="Arial"/>
-                        <w:b/>
-                        <w:bCs/>
-                        <w:color w:val="C00000"/>
-                        <w:sz w:val="16"/>
-                        <w:szCs w:val="16"/>
-                      </w:rPr>
-                      <w:t xml:space="preserve"> SS. ANNUNZIATA</w:t>
-                    </w:r>
-                  </w:p>
-                  <w:p>
-                    <w:r>
-                      <w:rPr>
-                        <w:rFonts w:ascii="Arial" w:hAnsi="Arial" w:cs="Arial"/>
-                        <w:bCs/>
-                        <w:color w:val="C00000"/>
-                        <w:sz w:val="16"/>
-                        <w:szCs w:val="16"/>
-                      </w:rPr>
-                      <w:t>Via E. De Nicola n. 14</w:t>
-                    </w:r>
-                  </w:p>
-                  <w:p>
-                    <w:r>
-                      <w:rPr>
-                        <w:rFonts w:ascii="Arial" w:hAnsi="Arial" w:cs="Arial"/>
-                        <w:bCs/>
-                        <w:color w:val="C00000"/>
-                        <w:sz w:val="16"/>
-                        <w:szCs w:val="16"/>
-                      </w:rPr>
-                      <w:t>07100 Sassari</w:t>
-                    </w:r>
-                  </w:p>
-                </w:txbxContent>
-              </v:textbox>
-              <w10:wrap anchorx="page" anchory="page"/>
-            </v:shape>
-          </w:pict>
-        </mc:Fallback>
-      </mc:AlternateContent>
-    </w:r>
-    <w:r>
-      <w:rPr>
-        <w:noProof/>
-      </w:rPr>
-      <mc:AlternateContent>
-        <mc:Choice Requires="wps">
-          <w:drawing>
-            <wp:anchor distT="0" distB="0" distL="114935" distR="114935" simplePos="0" relativeHeight="251664384" behindDoc="1" locked="0" layoutInCell="1" allowOverlap="1" wp14:anchorId="21D034EE" wp14:editId="01009582">
-              <wp:simplePos x="0" y="0"/>
-              <wp:positionH relativeFrom="page">
-                <wp:posOffset>721453</wp:posOffset>
-              </wp:positionH>
-              <wp:positionV relativeFrom="page">
-                <wp:posOffset>9680895</wp:posOffset>
-              </wp:positionV>
-              <wp:extent cx="1652631" cy="645953"/>
+              <wp:extent cx="2320925" cy="645795"/>
               <wp:effectExtent l="0" t="0" r="0" b="0"/>
               <wp:wrapNone/>
               <wp:docPr id="813125872" name="Text Box 3"/>
@@ -1944,7 +1654,7 @@
                     <wps:spPr bwMode="auto">
                       <a:xfrm>
                         <a:off x="0" y="0"/>
-                        <a:ext cx="1652631" cy="645953"/>
+                        <a:ext cx="2320925" cy="645795"/>
                       </a:xfrm>
                       <a:prstGeom prst="rect">
                         <a:avLst/>
@@ -2035,7 +1745,7 @@
                               <w:sz w:val="16"/>
                               <w:szCs w:val="16"/>
                             </w:rPr>
-                            <w:t>P. Iva</w:t>
+                            <w:t>P. IVA</w:t>
                           </w:r>
                           <w:r>
                             <w:rPr>
@@ -2058,17 +1768,7 @@
                               <w:sz w:val="16"/>
                               <w:szCs w:val="16"/>
                             </w:rPr>
-                            <w:t>www.aousassari.</w:t>
-                          </w:r>
-                          <w:r>
-                            <w:rPr>
-                              <w:rFonts w:ascii="Arial" w:hAnsi="Arial" w:cs="Arial"/>
-                              <w:bCs/>
-                              <w:color w:val="C00000"/>
-                              <w:sz w:val="16"/>
-                              <w:szCs w:val="16"/>
-                            </w:rPr>
-                            <w:t>it</w:t>
+                            <w:t>www.aousassari.it</w:t>
                           </w:r>
                         </w:p>
                       </w:txbxContent>
@@ -2090,7 +1790,11 @@
         </mc:Choice>
         <mc:Fallback>
           <w:pict>
-            <v:shape w14:anchorId="21D034EE" id="Text Box 3" o:spid="_x0000_s1029" type="#_x0000_t202" style="position:absolute;margin-left:56.8pt;margin-top:762.3pt;width:130.15pt;height:50.85pt;z-index:-251652096;visibility:visible;mso-wrap-style:square;mso-width-percent:0;mso-height-percent:0;mso-wrap-distance-left:9.05pt;mso-wrap-distance-top:0;mso-wrap-distance-right:9.05pt;mso-wrap-distance-bottom:0;mso-position-horizontal:absolute;mso-position-horizontal-relative:page;mso-position-vertical:absolute;mso-position-vertical-relative:page;mso-width-percent:0;mso-height-percent:0;mso-width-relative:page;mso-height-relative:page;v-text-anchor:top" o:gfxdata="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" stroked="f">
+            <v:shapetype w14:anchorId="7AF811E9" id="_x0000_t202" coordsize="21600,21600" o:spt="202" path="m,l,21600r21600,l21600,xe">
+              <v:stroke joinstyle="miter"/>
+              <v:path gradientshapeok="t" o:connecttype="rect"/>
+            </v:shapetype>
+            <v:shape id="Text Box 3" o:spid="_x0000_s1027" type="#_x0000_t202" style="position:absolute;margin-left:84.45pt;margin-top:762.7pt;width:182.75pt;height:50.85pt;z-index:-251640832;visibility:visible;mso-wrap-style:square;mso-width-percent:0;mso-height-percent:0;mso-wrap-distance-left:9.05pt;mso-wrap-distance-top:0;mso-wrap-distance-right:9.05pt;mso-wrap-distance-bottom:0;mso-position-horizontal:absolute;mso-position-horizontal-relative:page;mso-position-vertical:absolute;mso-position-vertical-relative:page;mso-width-percent:0;mso-height-percent:0;mso-width-relative:page;mso-height-relative:page;v-text-anchor:top" o:gfxdata="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" stroked="f">
               <v:fill opacity="0"/>
               <v:path arrowok="t"/>
               <v:textbox inset=".1pt,.1pt,7.3pt,3.7pt">
@@ -2158,7 +1862,7 @@
                         <w:sz w:val="16"/>
                         <w:szCs w:val="16"/>
                       </w:rPr>
-                      <w:t>P. Iva</w:t>
+                      <w:t>P. IVA</w:t>
                     </w:r>
                     <w:r>
                       <w:rPr>
@@ -2181,18 +1885,389 @@
                         <w:sz w:val="16"/>
                         <w:szCs w:val="16"/>
                       </w:rPr>
-                      <w:t>www.aousassari.</w:t>
+                      <w:t>www.aousassari.it</w:t>
+                    </w:r>
+                  </w:p>
+                </w:txbxContent>
+              </v:textbox>
+              <w10:wrap anchorx="page" anchory="page"/>
+            </v:shape>
+          </w:pict>
+        </mc:Fallback>
+      </mc:AlternateContent>
+    </w:r>
+    <w:r>
+      <w:rPr>
+        <w:noProof/>
+      </w:rPr>
+      <mc:AlternateContent>
+        <mc:Choice Requires="wps">
+          <w:drawing>
+            <wp:anchor distT="0" distB="0" distL="114935" distR="114935" simplePos="0" relativeHeight="251674624" behindDoc="1" locked="0" layoutInCell="1" allowOverlap="1" wp14:anchorId="10E44D54" wp14:editId="2A5AEB87">
+              <wp:simplePos x="0" y="0"/>
+              <wp:positionH relativeFrom="page">
+                <wp:posOffset>4283075</wp:posOffset>
+              </wp:positionH>
+              <wp:positionV relativeFrom="page">
+                <wp:posOffset>9697085</wp:posOffset>
+              </wp:positionV>
+              <wp:extent cx="2384425" cy="645795"/>
+              <wp:effectExtent l="0" t="0" r="0" b="0"/>
+              <wp:wrapNone/>
+              <wp:docPr id="251092099" name="Text Box 1"/>
+              <wp:cNvGraphicFramePr>
+                <a:graphicFrameLocks xmlns:a="http://schemas.openxmlformats.org/drawingml/2006/main"/>
+              </wp:cNvGraphicFramePr>
+              <a:graphic xmlns:a="http://schemas.openxmlformats.org/drawingml/2006/main">
+                <a:graphicData uri="http://schemas.microsoft.com/office/word/2010/wordprocessingShape">
+                  <wps:wsp>
+                    <wps:cNvSpPr txBox="1">
+                      <a:spLocks/>
+                    </wps:cNvSpPr>
+                    <wps:spPr bwMode="auto">
+                      <a:xfrm>
+                        <a:off x="0" y="0"/>
+                        <a:ext cx="2384425" cy="645795"/>
+                      </a:xfrm>
+                      <a:prstGeom prst="rect">
+                        <a:avLst/>
+                      </a:prstGeom>
+                      <a:solidFill>
+                        <a:srgbClr val="FFFFFF">
+                          <a:alpha val="0"/>
+                        </a:srgbClr>
+                      </a:solidFill>
+                      <a:ln>
+                        <a:noFill/>
+                      </a:ln>
+                      <a:extLst>
+                        <a:ext uri="{91240B29-F687-4F45-9708-019B960494DF}">
+                          <a14:hiddenLine xmlns:a14="http://schemas.microsoft.com/office/drawing/2010/main" w="9525">
+                            <a:solidFill>
+                              <a:srgbClr val="000000"/>
+                            </a:solidFill>
+                            <a:miter lim="800000"/>
+                            <a:headEnd/>
+                            <a:tailEnd/>
+                          </a14:hiddenLine>
+                        </a:ext>
+                      </a:extLst>
+                    </wps:spPr>
+                    <wps:txbx>
+                      <w:txbxContent>
+                        <w:p>
+                          <w:pPr>
+                            <w:rPr>
+                              <w:iCs/>
+                              <w:sz w:val="15"/>
+                              <w:szCs w:val="15"/>
+                            </w:rPr>
+                          </w:pPr>
+                          <w:r>
+                            <w:rPr>
+                              <w:rFonts w:ascii="Arial" w:eastAsia="Times New Roman" w:hAnsi="Arial" w:cs="Arial"/>
+                              <w:b/>
+                              <w:bCs/>
+                              <w:iCs/>
+                              <w:color w:val="C00000"/>
+                              <w:sz w:val="15"/>
+                              <w:szCs w:val="15"/>
+                            </w:rPr>
+                            <w:t>U.O.C. Cardiologia Clinica e Interventistica</w:t>
+                          </w:r>
+                        </w:p>
+                        <w:p>
+                          <w:pPr>
+                            <w:rPr>
+                              <w:iCs/>
+                              <w:sz w:val="15"/>
+                              <w:szCs w:val="15"/>
+                            </w:rPr>
+                          </w:pPr>
+                          <w:r>
+                            <w:rPr>
+                              <w:rFonts w:ascii="Arial" w:eastAsia="Times New Roman" w:hAnsi="Arial" w:cs="Arial"/>
+                              <w:iCs/>
+                              <w:color w:val="C00000"/>
+                              <w:sz w:val="15"/>
+                              <w:szCs w:val="15"/>
+                            </w:rPr>
+                            <w:t xml:space="preserve">Via E. De Nicola n. </w:t>
+                          </w:r>
+                          <w:r>
+                            <w:rPr>
+                              <w:rFonts w:ascii="Arial" w:eastAsia="Times New Roman" w:hAnsi="Arial" w:cs="Arial"/>
+                              <w:iCs/>
+                              <w:color w:val="C00000"/>
+                              <w:sz w:val="15"/>
+                              <w:szCs w:val="15"/>
+                            </w:rPr>
+                            <w:t>39</w:t>
+                          </w:r>
+                        </w:p>
+                        <w:p>
+                          <w:pPr>
+                            <w:rPr>
+                              <w:rFonts w:ascii="Arial" w:eastAsia="Times New Roman" w:hAnsi="Arial" w:cs="Arial"/>
+                              <w:bCs/>
+                              <w:i/>
+                              <w:color w:val="C00000"/>
+                              <w:sz w:val="15"/>
+                              <w:szCs w:val="15"/>
+                            </w:rPr>
+                          </w:pPr>
+                          <w:r>
+                            <w:rPr>
+                              <w:rFonts w:ascii="Arial" w:eastAsia="Times New Roman" w:hAnsi="Arial" w:cs="Arial"/>
+                              <w:bCs/>
+                              <w:i/>
+                              <w:color w:val="C00000"/>
+                              <w:sz w:val="15"/>
+                              <w:szCs w:val="15"/>
+                            </w:rPr>
+                            <w:t>07100 Sassari</w:t>
+                          </w:r>
+                        </w:p>
+                        <w:p>
+                          <w:pPr>
+                            <w:rPr>
+                              <w:sz w:val="15"/>
+                              <w:szCs w:val="15"/>
+                            </w:rPr>
+                          </w:pPr>
+                          <w:r>
+                            <w:rPr>
+                              <w:rFonts w:ascii="Arial" w:eastAsia="Times New Roman" w:hAnsi="Arial" w:cs="Arial"/>
+                              <w:bCs/>
+                              <w:i/>
+                              <w:color w:val="C00000"/>
+                              <w:sz w:val="15"/>
+                              <w:szCs w:val="15"/>
+                            </w:rPr>
+                            <w:t>Tel. 079</w:t>
+                          </w:r>
+                          <w:r>
+                            <w:rPr>
+                              <w:rFonts w:ascii="Arial" w:eastAsia="Times New Roman" w:hAnsi="Arial" w:cs="Arial"/>
+                              <w:bCs/>
+                              <w:i/>
+                              <w:color w:val="C00000"/>
+                              <w:sz w:val="15"/>
+                              <w:szCs w:val="15"/>
+                            </w:rPr>
+                            <w:t>.2426120</w:t>
+                          </w:r>
+                        </w:p>
+                        <w:p>
+                          <w:pPr>
+                            <w:rPr>
+                              <w:sz w:val="15"/>
+                              <w:szCs w:val="15"/>
+                            </w:rPr>
+                          </w:pPr>
+                          <w:r>
+                            <w:rPr>
+                              <w:rFonts w:ascii="Arial" w:eastAsia="Times New Roman" w:hAnsi="Arial" w:cs="Arial"/>
+                              <w:bCs/>
+                              <w:i/>
+                              <w:color w:val="C00000"/>
+                              <w:sz w:val="15"/>
+                              <w:szCs w:val="15"/>
+                            </w:rPr>
+                            <w:t>e-mail segreteria: segreteria.cardiologia@aouss.it</w:t>
+                          </w:r>
+                          <w:r>
+                            <w:rPr>
+                              <w:rFonts w:ascii="Arial" w:eastAsia="Arial" w:hAnsi="Arial" w:cs="Arial"/>
+                              <w:bCs/>
+                              <w:color w:val="C00000"/>
+                              <w:sz w:val="15"/>
+                              <w:szCs w:val="15"/>
+                            </w:rPr>
+                            <w:t xml:space="preserve">               </w:t>
+                          </w:r>
+                        </w:p>
+                        <w:p>
+                          <w:pPr>
+                            <w:autoSpaceDE w:val="0"/>
+                            <w:rPr>
+                              <w:rFonts w:ascii="Arial" w:eastAsia="Times New Roman" w:hAnsi="Arial" w:cs="Arial"/>
+                              <w:bCs/>
+                              <w:i/>
+                              <w:color w:val="00B0F0"/>
+                              <w:sz w:val="15"/>
+                              <w:szCs w:val="15"/>
+                            </w:rPr>
+                          </w:pPr>
+                        </w:p>
+                      </w:txbxContent>
+                    </wps:txbx>
+                    <wps:bodyPr rot="0" vert="horz" wrap="square" lIns="1270" tIns="1270" rIns="92710" bIns="46990" anchor="t" anchorCtr="0" upright="1">
+                      <a:noAutofit/>
+                    </wps:bodyPr>
+                  </wps:wsp>
+                </a:graphicData>
+              </a:graphic>
+              <wp14:sizeRelH relativeFrom="page">
+                <wp14:pctWidth>0</wp14:pctWidth>
+              </wp14:sizeRelH>
+              <wp14:sizeRelV relativeFrom="page">
+                <wp14:pctHeight>0</wp14:pctHeight>
+              </wp14:sizeRelV>
+            </wp:anchor>
+          </w:drawing>
+        </mc:Choice>
+        <mc:Fallback>
+          <w:pict>
+            <v:shape w14:anchorId="10E44D54" id="Text Box 1" o:spid="_x0000_s1028" type="#_x0000_t202" style="position:absolute;margin-left:337.25pt;margin-top:763.55pt;width:187.75pt;height:50.85pt;z-index:-251641856;visibility:visible;mso-wrap-style:square;mso-width-percent:0;mso-height-percent:0;mso-wrap-distance-left:9.05pt;mso-wrap-distance-top:0;mso-wrap-distance-right:9.05pt;mso-wrap-distance-bottom:0;mso-position-horizontal:absolute;mso-position-horizontal-relative:page;mso-position-vertical:absolute;mso-position-vertical-relative:page;mso-width-percent:0;mso-height-percent:0;mso-width-relative:page;mso-height-relative:page;v-text-anchor:top" o:gfxdata="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" stroked="f">
+              <v:fill opacity="0"/>
+              <v:path arrowok="t"/>
+              <v:textbox inset=".1pt,.1pt,7.3pt,3.7pt">
+                <w:txbxContent>
+                  <w:p>
+                    <w:pPr>
+                      <w:rPr>
+                        <w:iCs/>
+                        <w:sz w:val="15"/>
+                        <w:szCs w:val="15"/>
+                      </w:rPr>
+                    </w:pPr>
+                    <w:r>
+                      <w:rPr>
+                        <w:rFonts w:ascii="Arial" w:eastAsia="Times New Roman" w:hAnsi="Arial" w:cs="Arial"/>
+                        <w:b/>
+                        <w:bCs/>
+                        <w:iCs/>
+                        <w:color w:val="C00000"/>
+                        <w:sz w:val="15"/>
+                        <w:szCs w:val="15"/>
+                      </w:rPr>
+                      <w:t>U.O.C. Cardiologia Clinica e Interventistica</w:t>
+                    </w:r>
+                  </w:p>
+                  <w:p>
+                    <w:pPr>
+                      <w:rPr>
+                        <w:iCs/>
+                        <w:sz w:val="15"/>
+                        <w:szCs w:val="15"/>
+                      </w:rPr>
+                    </w:pPr>
+                    <w:r>
+                      <w:rPr>
+                        <w:rFonts w:ascii="Arial" w:eastAsia="Times New Roman" w:hAnsi="Arial" w:cs="Arial"/>
+                        <w:iCs/>
+                        <w:color w:val="C00000"/>
+                        <w:sz w:val="15"/>
+                        <w:szCs w:val="15"/>
+                      </w:rPr>
+                      <w:t xml:space="preserve">Via E. De Nicola n. </w:t>
                     </w:r>
                     <w:r>
                       <w:rPr>
-                        <w:rFonts w:ascii="Arial" w:hAnsi="Arial" w:cs="Arial"/>
+                        <w:rFonts w:ascii="Arial" w:eastAsia="Times New Roman" w:hAnsi="Arial" w:cs="Arial"/>
+                        <w:iCs/>
+                        <w:color w:val="C00000"/>
+                        <w:sz w:val="15"/>
+                        <w:szCs w:val="15"/>
+                      </w:rPr>
+                      <w:t>39</w:t>
+                    </w:r>
+                  </w:p>
+                  <w:p>
+                    <w:pPr>
+                      <w:rPr>
+                        <w:rFonts w:ascii="Arial" w:eastAsia="Times New Roman" w:hAnsi="Arial" w:cs="Arial"/>
+                        <w:bCs/>
+                        <w:i/>
+                        <w:color w:val="C00000"/>
+                        <w:sz w:val="15"/>
+                        <w:szCs w:val="15"/>
+                      </w:rPr>
+                    </w:pPr>
+                    <w:r>
+                      <w:rPr>
+                        <w:rFonts w:ascii="Arial" w:eastAsia="Times New Roman" w:hAnsi="Arial" w:cs="Arial"/>
+                        <w:bCs/>
+                        <w:i/>
+                        <w:color w:val="C00000"/>
+                        <w:sz w:val="15"/>
+                        <w:szCs w:val="15"/>
+                      </w:rPr>
+                      <w:t>07100 Sassari</w:t>
+                    </w:r>
+                  </w:p>
+                  <w:p>
+                    <w:pPr>
+                      <w:rPr>
+                        <w:sz w:val="15"/>
+                        <w:szCs w:val="15"/>
+                      </w:rPr>
+                    </w:pPr>
+                    <w:r>
+                      <w:rPr>
+                        <w:rFonts w:ascii="Arial" w:eastAsia="Times New Roman" w:hAnsi="Arial" w:cs="Arial"/>
+                        <w:bCs/>
+                        <w:i/>
+                        <w:color w:val="C00000"/>
+                        <w:sz w:val="15"/>
+                        <w:szCs w:val="15"/>
+                      </w:rPr>
+                      <w:t>Tel. 079</w:t>
+                    </w:r>
+                    <w:r>
+                      <w:rPr>
+                        <w:rFonts w:ascii="Arial" w:eastAsia="Times New Roman" w:hAnsi="Arial" w:cs="Arial"/>
+                        <w:bCs/>
+                        <w:i/>
+                        <w:color w:val="C00000"/>
+                        <w:sz w:val="15"/>
+                        <w:szCs w:val="15"/>
+                      </w:rPr>
+                      <w:t>.2426120</w:t>
+                    </w:r>
+                  </w:p>
+                  <w:p>
+                    <w:pPr>
+                      <w:rPr>
+                        <w:sz w:val="15"/>
+                        <w:szCs w:val="15"/>
+                      </w:rPr>
+                    </w:pPr>
+                    <w:r>
+                      <w:rPr>
+                        <w:rFonts w:ascii="Arial" w:eastAsia="Times New Roman" w:hAnsi="Arial" w:cs="Arial"/>
+                        <w:bCs/>
+                        <w:i/>
+                        <w:color w:val="C00000"/>
+                        <w:sz w:val="15"/>
+                        <w:szCs w:val="15"/>
+                      </w:rPr>
+                      <w:t>e-mail segreteria: segreteria.cardiologia@aouss.it</w:t>
+                    </w:r>
+                    <w:r>
+                      <w:rPr>
+                        <w:rFonts w:ascii="Arial" w:eastAsia="Arial" w:hAnsi="Arial" w:cs="Arial"/>
                         <w:bCs/>
                         <w:color w:val="C00000"/>
-                        <w:sz w:val="16"/>
-                        <w:szCs w:val="16"/>
+                        <w:sz w:val="15"/>
+                        <w:szCs w:val="15"/>
                       </w:rPr>
-                      <w:t>it</w:t>
+                      <w:t xml:space="preserve">               </w:t>
                     </w:r>
+                  </w:p>
+                  <w:p>
+                    <w:pPr>
+                      <w:autoSpaceDE w:val="0"/>
+                      <w:rPr>
+                        <w:rFonts w:ascii="Arial" w:eastAsia="Times New Roman" w:hAnsi="Arial" w:cs="Arial"/>
+                        <w:bCs/>
+                        <w:i/>
+                        <w:color w:val="00B0F0"/>
+                        <w:sz w:val="15"/>
+                        <w:szCs w:val="15"/>
+                      </w:rPr>
+                    </w:pPr>
                   </w:p>
                 </w:txbxContent>
               </v:textbox>
@@ -2214,7 +2289,7 @@
       <mc:AlternateContent>
         <mc:Choice Requires="wps">
           <w:drawing>
-            <wp:anchor distT="0" distB="0" distL="114300" distR="114300" simplePos="0" relativeHeight="251662336" behindDoc="0" locked="0" layoutInCell="1" allowOverlap="1" wp14:anchorId="57C90CDB" wp14:editId="75CE2432">
+            <wp:anchor distT="0" distB="0" distL="114300" distR="114300" simplePos="0" relativeHeight="251662336" behindDoc="0" locked="0" layoutInCell="1" allowOverlap="1" wp14:anchorId="57C90CDB" wp14:editId="102B38CA">
               <wp:simplePos x="0" y="0"/>
               <wp:positionH relativeFrom="column">
                 <wp:posOffset>0</wp:posOffset>
@@ -2268,7 +2343,7 @@
         </mc:Choice>
         <mc:Fallback>
           <w:pict>
-            <v:line w14:anchorId="2C275B7C" id="Connettore 1 4" o:spid="_x0000_s1026" style="position:absolute;z-index:251662336;visibility:visible;mso-wrap-style:square;mso-wrap-distance-left:9pt;mso-wrap-distance-top:0;mso-wrap-distance-right:9pt;mso-wrap-distance-bottom:0;mso-position-horizontal:absolute;mso-position-horizontal-relative:text;mso-position-vertical:absolute;mso-position-vertical-relative:text" from="0,-1.15pt" to="483.5pt,-1.15pt" o:gfxdata="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" strokecolor="#e20913" strokeweight="1pt">
+            <v:line w14:anchorId="26AB4EE1" id="Connettore 1 4" o:spid="_x0000_s1026" style="position:absolute;z-index:251662336;visibility:visible;mso-wrap-style:square;mso-wrap-distance-left:9pt;mso-wrap-distance-top:0;mso-wrap-distance-right:9pt;mso-wrap-distance-bottom:0;mso-position-horizontal:absolute;mso-position-horizontal-relative:text;mso-position-vertical:absolute;mso-position-vertical-relative:text" from="0,-1.15pt" to="483.5pt,-1.15pt" o:gfxdata="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" strokecolor="#e20913" strokeweight="1pt">
               <v:stroke joinstyle="miter"/>
             </v:line>
           </w:pict>

</xml_diff>